<commit_message>
doc: add ‵Logical Architecture‵ and organize diagrams
</commit_message>
<xml_diff>
--- a/document/hw7.docx
+++ b/document/hw7.docx
@@ -83,6 +83,8 @@
           <w:szCs w:val="52"/>
         </w:rPr>
       </w:pPr>
+      <w:proofErr w:type="spellStart"/>
+      <w:proofErr w:type="gramStart"/>
       <w:r>
         <w:rPr>
           <w:rFonts w:ascii="Times New Roman" w:eastAsia="標楷體" w:hAnsi="Times New Roman" w:cs="Times New Roman" w:hint="eastAsia"/>
@@ -93,6 +95,8 @@
         </w:rPr>
         <w:t>Re:Book</w:t>
       </w:r>
+      <w:proofErr w:type="spellEnd"/>
+      <w:proofErr w:type="gramEnd"/>
     </w:p>
     <w:p>
       <w:pPr>
@@ -197,21 +201,23 @@
           <w:szCs w:val="40"/>
         </w:rPr>
       </w:pPr>
+      <w:proofErr w:type="gramStart"/>
       <w:r>
         <w:rPr>
           <w:rFonts w:ascii="Times New Roman" w:eastAsia="標楷體" w:hAnsi="Times New Roman" w:cs="Times New Roman"/>
           <w:sz w:val="40"/>
           <w:szCs w:val="40"/>
         </w:rPr>
-        <w:t>資工碩二</w:t>
-      </w:r>
+        <w:t>資工碩</w:t>
+      </w:r>
+      <w:proofErr w:type="gramEnd"/>
       <w:r>
         <w:rPr>
           <w:rFonts w:ascii="Times New Roman" w:eastAsia="標楷體" w:hAnsi="Times New Roman" w:cs="Times New Roman"/>
           <w:sz w:val="40"/>
           <w:szCs w:val="40"/>
         </w:rPr>
-        <w:t xml:space="preserve"> 113598037 </w:t>
+        <w:t>二</w:t>
       </w:r>
       <w:r>
         <w:rPr>
@@ -219,26 +225,54 @@
           <w:sz w:val="40"/>
           <w:szCs w:val="40"/>
         </w:rPr>
-        <w:t>陳宥錡</w:t>
-      </w:r>
-    </w:p>
-    <w:p>
-      <w:pPr>
-        <w:jc w:val="center"/>
+        <w:t xml:space="preserve"> 113598037 </w:t>
+      </w:r>
+      <w:r>
         <w:rPr>
           <w:rFonts w:ascii="Times New Roman" w:eastAsia="標楷體" w:hAnsi="Times New Roman" w:cs="Times New Roman"/>
           <w:sz w:val="40"/>
           <w:szCs w:val="40"/>
         </w:rPr>
-      </w:pPr>
+        <w:t>陳</w:t>
+      </w:r>
+      <w:proofErr w:type="gramStart"/>
       <w:r>
         <w:rPr>
           <w:rFonts w:ascii="Times New Roman" w:eastAsia="標楷體" w:hAnsi="Times New Roman" w:cs="Times New Roman"/>
           <w:sz w:val="40"/>
           <w:szCs w:val="40"/>
         </w:rPr>
-        <w:t>資工碩一</w:t>
-      </w:r>
+        <w:t>宥錡</w:t>
+      </w:r>
+      <w:proofErr w:type="gramEnd"/>
+    </w:p>
+    <w:p>
+      <w:pPr>
+        <w:jc w:val="center"/>
+        <w:rPr>
+          <w:rFonts w:ascii="Times New Roman" w:eastAsia="標楷體" w:hAnsi="Times New Roman" w:cs="Times New Roman"/>
+          <w:sz w:val="40"/>
+          <w:szCs w:val="40"/>
+        </w:rPr>
+      </w:pPr>
+      <w:r>
+        <w:rPr>
+          <w:rFonts w:ascii="Times New Roman" w:eastAsia="標楷體" w:hAnsi="Times New Roman" w:cs="Times New Roman"/>
+          <w:sz w:val="40"/>
+          <w:szCs w:val="40"/>
+        </w:rPr>
+        <w:t>資工碩</w:t>
+      </w:r>
+      <w:proofErr w:type="gramStart"/>
+      <w:r>
+        <w:rPr>
+          <w:rFonts w:ascii="Times New Roman" w:eastAsia="標楷體" w:hAnsi="Times New Roman" w:cs="Times New Roman"/>
+          <w:sz w:val="40"/>
+          <w:szCs w:val="40"/>
+        </w:rPr>
+        <w:t>一</w:t>
+      </w:r>
+      <w:proofErr w:type="gramEnd"/>
       <w:r>
         <w:rPr>
           <w:rFonts w:ascii="Times New Roman" w:eastAsia="標楷體" w:hAnsi="Times New Roman" w:cs="Times New Roman"/>
@@ -914,11 +948,19 @@
           <w:rFonts w:ascii="Times New Roman" w:eastAsia="標楷體" w:hAnsi="Times New Roman" w:cs="Times New Roman"/>
         </w:rPr>
       </w:pPr>
-      <w:r>
-        <w:rPr>
-          <w:rFonts w:ascii="Times New Roman" w:eastAsia="標楷體" w:hAnsi="Times New Roman" w:cs="Times New Roman" w:hint="eastAsia"/>
-        </w:rPr>
-        <w:t xml:space="preserve">Re:Book </w:t>
+      <w:proofErr w:type="spellStart"/>
+      <w:r>
+        <w:rPr>
+          <w:rFonts w:ascii="Times New Roman" w:eastAsia="標楷體" w:hAnsi="Times New Roman" w:cs="Times New Roman" w:hint="eastAsia"/>
+        </w:rPr>
+        <w:t>Re:Book</w:t>
+      </w:r>
+      <w:proofErr w:type="spellEnd"/>
+      <w:r>
+        <w:rPr>
+          <w:rFonts w:ascii="Times New Roman" w:eastAsia="標楷體" w:hAnsi="Times New Roman" w:cs="Times New Roman" w:hint="eastAsia"/>
+        </w:rPr>
+        <w:t xml:space="preserve"> </w:t>
       </w:r>
       <w:r>
         <w:rPr>
@@ -945,11 +987,19 @@
           <w:rFonts w:ascii="Times New Roman" w:eastAsia="標楷體" w:hAnsi="Times New Roman" w:cs="Times New Roman"/>
         </w:rPr>
       </w:pPr>
-      <w:r>
-        <w:rPr>
-          <w:rFonts w:ascii="Times New Roman" w:eastAsia="標楷體" w:hAnsi="Times New Roman" w:cs="Times New Roman" w:hint="eastAsia"/>
-        </w:rPr>
-        <w:t xml:space="preserve">Re:Book </w:t>
+      <w:proofErr w:type="spellStart"/>
+      <w:r>
+        <w:rPr>
+          <w:rFonts w:ascii="Times New Roman" w:eastAsia="標楷體" w:hAnsi="Times New Roman" w:cs="Times New Roman" w:hint="eastAsia"/>
+        </w:rPr>
+        <w:t>Re:Book</w:t>
+      </w:r>
+      <w:proofErr w:type="spellEnd"/>
+      <w:r>
+        <w:rPr>
+          <w:rFonts w:ascii="Times New Roman" w:eastAsia="標楷體" w:hAnsi="Times New Roman" w:cs="Times New Roman" w:hint="eastAsia"/>
+        </w:rPr>
+        <w:t xml:space="preserve"> </w:t>
       </w:r>
       <w:r>
         <w:rPr>
@@ -979,7 +1029,35 @@
         <w:rPr>
           <w:rFonts w:ascii="Times New Roman" w:eastAsia="標楷體" w:hAnsi="Times New Roman" w:cs="Times New Roman" w:hint="eastAsia"/>
         </w:rPr>
-        <w:t>類。為體現對書本價值的尊重，賣家可設定期望售價，並上傳書況照片或分享使用心得。潛在買家則可透過搜尋與篩選功能，快速找到所需書籍。平台同時提供私訊機制，讓雙方協商最終價格與交付方式，確保知識的傳遞過程既順暢高效，也保有人與人之間的溫度。</w:t>
+        <w:t>類。為體現對書本價值的尊重，賣家可設定期望售價，並上傳書</w:t>
+      </w:r>
+      <w:proofErr w:type="gramStart"/>
+      <w:r>
+        <w:rPr>
+          <w:rFonts w:ascii="Times New Roman" w:eastAsia="標楷體" w:hAnsi="Times New Roman" w:cs="Times New Roman" w:hint="eastAsia"/>
+        </w:rPr>
+        <w:t>況</w:t>
+      </w:r>
+      <w:proofErr w:type="gramEnd"/>
+      <w:r>
+        <w:rPr>
+          <w:rFonts w:ascii="Times New Roman" w:eastAsia="標楷體" w:hAnsi="Times New Roman" w:cs="Times New Roman" w:hint="eastAsia"/>
+        </w:rPr>
+        <w:t>照片或分享使用心得。潛在買家則可透過搜尋與篩選功能，快速找到所需書籍。平台同時</w:t>
+      </w:r>
+      <w:proofErr w:type="gramStart"/>
+      <w:r>
+        <w:rPr>
+          <w:rFonts w:ascii="Times New Roman" w:eastAsia="標楷體" w:hAnsi="Times New Roman" w:cs="Times New Roman" w:hint="eastAsia"/>
+        </w:rPr>
+        <w:t>提供私訊機制</w:t>
+      </w:r>
+      <w:proofErr w:type="gramEnd"/>
+      <w:r>
+        <w:rPr>
+          <w:rFonts w:ascii="Times New Roman" w:eastAsia="標楷體" w:hAnsi="Times New Roman" w:cs="Times New Roman" w:hint="eastAsia"/>
+        </w:rPr>
+        <w:t>，讓雙方協商最終價格與交付方式，確保知識的傳遞過程既順暢高效，也保有人與人之間的溫度。</w:t>
       </w:r>
     </w:p>
     <w:p>
@@ -1207,12 +1285,14 @@
                 <w:rFonts w:ascii="Times New Roman" w:eastAsia="標楷體" w:hAnsi="Times New Roman" w:cs="Times New Roman"/>
               </w:rPr>
             </w:pPr>
+            <w:proofErr w:type="gramStart"/>
             <w:r>
               <w:rPr>
                 <w:rFonts w:ascii="Times New Roman" w:eastAsia="標楷體" w:hAnsi="Times New Roman" w:cs="Times New Roman" w:hint="eastAsia"/>
               </w:rPr>
               <w:t>發送私訊</w:t>
             </w:r>
+            <w:proofErr w:type="gramEnd"/>
           </w:p>
         </w:tc>
       </w:tr>
@@ -1519,12 +1599,16 @@
                 <w:rFonts w:ascii="Times New Roman" w:eastAsia="標楷體" w:hAnsi="Times New Roman" w:cs="Times New Roman"/>
               </w:rPr>
             </w:pPr>
+            <w:proofErr w:type="spellStart"/>
+            <w:proofErr w:type="gramStart"/>
             <w:r>
               <w:rPr>
                 <w:rFonts w:ascii="Times New Roman" w:eastAsia="標楷體" w:hAnsi="Times New Roman" w:cs="Times New Roman" w:hint="eastAsia"/>
               </w:rPr>
               <w:t>Re:Book</w:t>
             </w:r>
+            <w:proofErr w:type="spellEnd"/>
+            <w:proofErr w:type="gramEnd"/>
           </w:p>
         </w:tc>
       </w:tr>
@@ -1898,7 +1982,21 @@
               <w:rPr>
                 <w:rFonts w:ascii="Times New Roman" w:eastAsia="標楷體" w:hAnsi="Times New Roman" w:cs="Times New Roman" w:hint="eastAsia"/>
               </w:rPr>
-              <w:t>、書名、價格、書況及</w:t>
+              <w:t>、書名、價格、書</w:t>
+            </w:r>
+            <w:proofErr w:type="gramStart"/>
+            <w:r>
+              <w:rPr>
+                <w:rFonts w:ascii="Times New Roman" w:eastAsia="標楷體" w:hAnsi="Times New Roman" w:cs="Times New Roman" w:hint="eastAsia"/>
+              </w:rPr>
+              <w:t>況</w:t>
+            </w:r>
+            <w:proofErr w:type="gramEnd"/>
+            <w:r>
+              <w:rPr>
+                <w:rFonts w:ascii="Times New Roman" w:eastAsia="標楷體" w:hAnsi="Times New Roman" w:cs="Times New Roman" w:hint="eastAsia"/>
+              </w:rPr>
+              <w:t>及</w:t>
             </w:r>
             <w:r>
               <w:rPr>
@@ -1955,12 +2053,14 @@
               </w:rPr>
               <w:t>格式</w:t>
             </w:r>
+            <w:proofErr w:type="gramStart"/>
             <w:r>
               <w:rPr>
                 <w:rFonts w:ascii="Times New Roman" w:eastAsia="標楷體" w:hAnsi="Times New Roman" w:cs="Times New Roman" w:hint="eastAsia"/>
               </w:rPr>
               <w:t>與必填欄位</w:t>
             </w:r>
+            <w:proofErr w:type="gramEnd"/>
             <w:r>
               <w:rPr>
                 <w:rFonts w:ascii="Times New Roman" w:eastAsia="標楷體" w:hAnsi="Times New Roman" w:cs="Times New Roman" w:hint="eastAsia"/>
@@ -2656,12 +2756,16 @@
                 <w:rFonts w:ascii="Times New Roman" w:eastAsia="標楷體" w:hAnsi="Times New Roman" w:cs="Times New Roman"/>
               </w:rPr>
             </w:pPr>
+            <w:proofErr w:type="spellStart"/>
+            <w:proofErr w:type="gramStart"/>
             <w:r>
               <w:rPr>
                 <w:rFonts w:ascii="Times New Roman" w:eastAsia="標楷體" w:hAnsi="Times New Roman" w:cs="Times New Roman" w:hint="eastAsia"/>
               </w:rPr>
               <w:t>Re:Book</w:t>
             </w:r>
+            <w:proofErr w:type="spellEnd"/>
+            <w:proofErr w:type="gramEnd"/>
           </w:p>
         </w:tc>
       </w:tr>
@@ -2986,7 +3090,21 @@
               <w:rPr>
                 <w:rFonts w:ascii="Times New Roman" w:eastAsia="標楷體" w:hAnsi="Times New Roman" w:cs="Times New Roman" w:hint="eastAsia"/>
               </w:rPr>
-              <w:t>買家選擇篩選條件（如：</w:t>
+              <w:t>買家選擇篩選條件</w:t>
+            </w:r>
+            <w:proofErr w:type="gramStart"/>
+            <w:r>
+              <w:rPr>
+                <w:rFonts w:ascii="Times New Roman" w:eastAsia="標楷體" w:hAnsi="Times New Roman" w:cs="Times New Roman" w:hint="eastAsia"/>
+              </w:rPr>
+              <w:t>（</w:t>
+            </w:r>
+            <w:proofErr w:type="gramEnd"/>
+            <w:r>
+              <w:rPr>
+                <w:rFonts w:ascii="Times New Roman" w:eastAsia="標楷體" w:hAnsi="Times New Roman" w:cs="Times New Roman" w:hint="eastAsia"/>
+              </w:rPr>
+              <w:t>如：</w:t>
             </w:r>
             <w:r>
               <w:rPr>
@@ -2998,7 +3116,21 @@
               <w:rPr>
                 <w:rFonts w:ascii="Times New Roman" w:eastAsia="標楷體" w:hAnsi="Times New Roman" w:cs="Times New Roman" w:hint="eastAsia"/>
               </w:rPr>
-              <w:t>、價格範圍）。</w:t>
+              <w:t>、價格範圍</w:t>
+            </w:r>
+            <w:proofErr w:type="gramStart"/>
+            <w:r>
+              <w:rPr>
+                <w:rFonts w:ascii="Times New Roman" w:eastAsia="標楷體" w:hAnsi="Times New Roman" w:cs="Times New Roman" w:hint="eastAsia"/>
+              </w:rPr>
+              <w:t>）</w:t>
+            </w:r>
+            <w:proofErr w:type="gramEnd"/>
+            <w:r>
+              <w:rPr>
+                <w:rFonts w:ascii="Times New Roman" w:eastAsia="標楷體" w:hAnsi="Times New Roman" w:cs="Times New Roman" w:hint="eastAsia"/>
+              </w:rPr>
+              <w:t>。</w:t>
             </w:r>
           </w:p>
           <w:p>
@@ -3426,12 +3558,16 @@
                 <w:rFonts w:ascii="Times New Roman" w:eastAsia="標楷體" w:hAnsi="Times New Roman" w:cs="Times New Roman"/>
               </w:rPr>
             </w:pPr>
+            <w:proofErr w:type="spellStart"/>
+            <w:proofErr w:type="gramStart"/>
             <w:r>
               <w:rPr>
                 <w:rFonts w:ascii="Times New Roman" w:eastAsia="標楷體" w:hAnsi="Times New Roman" w:cs="Times New Roman" w:hint="eastAsia"/>
               </w:rPr>
               <w:t>Re:Book</w:t>
             </w:r>
+            <w:proofErr w:type="spellEnd"/>
+            <w:proofErr w:type="gramEnd"/>
           </w:p>
         </w:tc>
       </w:tr>
@@ -3732,7 +3868,35 @@
               <w:rPr>
                 <w:rFonts w:ascii="Times New Roman" w:eastAsia="標楷體" w:hAnsi="Times New Roman" w:cs="Times New Roman" w:hint="eastAsia"/>
               </w:rPr>
-              <w:t>系統顯示訂單資訊與線下交易選項（如：面交付現、自行匯款）。</w:t>
+              <w:t>系統顯示訂單資訊與線下交易選項</w:t>
+            </w:r>
+            <w:proofErr w:type="gramStart"/>
+            <w:r>
+              <w:rPr>
+                <w:rFonts w:ascii="Times New Roman" w:eastAsia="標楷體" w:hAnsi="Times New Roman" w:cs="Times New Roman" w:hint="eastAsia"/>
+              </w:rPr>
+              <w:t>（</w:t>
+            </w:r>
+            <w:proofErr w:type="gramEnd"/>
+            <w:r>
+              <w:rPr>
+                <w:rFonts w:ascii="Times New Roman" w:eastAsia="標楷體" w:hAnsi="Times New Roman" w:cs="Times New Roman" w:hint="eastAsia"/>
+              </w:rPr>
+              <w:t>如：面交付現、自行匯款</w:t>
+            </w:r>
+            <w:proofErr w:type="gramStart"/>
+            <w:r>
+              <w:rPr>
+                <w:rFonts w:ascii="Times New Roman" w:eastAsia="標楷體" w:hAnsi="Times New Roman" w:cs="Times New Roman" w:hint="eastAsia"/>
+              </w:rPr>
+              <w:t>）</w:t>
+            </w:r>
+            <w:proofErr w:type="gramEnd"/>
+            <w:r>
+              <w:rPr>
+                <w:rFonts w:ascii="Times New Roman" w:eastAsia="標楷體" w:hAnsi="Times New Roman" w:cs="Times New Roman" w:hint="eastAsia"/>
+              </w:rPr>
+              <w:t>。</w:t>
             </w:r>
           </w:p>
           <w:p>
@@ -4129,7 +4293,21 @@
               <w:rPr>
                 <w:rFonts w:ascii="Times New Roman" w:eastAsia="標楷體" w:hAnsi="Times New Roman" w:cs="Times New Roman"/>
               </w:rPr>
-              <w:t>是否需要設定自動取消機制？（例如：訂單成立後</w:t>
+              <w:t>是否需要設定自動取消機制？</w:t>
+            </w:r>
+            <w:proofErr w:type="gramStart"/>
+            <w:r>
+              <w:rPr>
+                <w:rFonts w:ascii="Times New Roman" w:eastAsia="標楷體" w:hAnsi="Times New Roman" w:cs="Times New Roman"/>
+              </w:rPr>
+              <w:t>（</w:t>
+            </w:r>
+            <w:proofErr w:type="gramEnd"/>
+            <w:r>
+              <w:rPr>
+                <w:rFonts w:ascii="Times New Roman" w:eastAsia="標楷體" w:hAnsi="Times New Roman" w:cs="Times New Roman"/>
+              </w:rPr>
+              <w:t>例如：訂單成立後</w:t>
             </w:r>
             <w:r>
               <w:rPr>
@@ -4141,7 +4319,21 @@
               <w:rPr>
                 <w:rFonts w:ascii="Times New Roman" w:eastAsia="標楷體" w:hAnsi="Times New Roman" w:cs="Times New Roman"/>
               </w:rPr>
-              <w:t>天內未點擊完成，系統自動取消並恢復書籍狀態）。</w:t>
+              <w:t>天內未點擊完成，系統自動取消並恢復書籍狀態</w:t>
+            </w:r>
+            <w:proofErr w:type="gramStart"/>
+            <w:r>
+              <w:rPr>
+                <w:rFonts w:ascii="Times New Roman" w:eastAsia="標楷體" w:hAnsi="Times New Roman" w:cs="Times New Roman"/>
+              </w:rPr>
+              <w:t>）</w:t>
+            </w:r>
+            <w:proofErr w:type="gramEnd"/>
+            <w:r>
+              <w:rPr>
+                <w:rFonts w:ascii="Times New Roman" w:eastAsia="標楷體" w:hAnsi="Times New Roman" w:cs="Times New Roman"/>
+              </w:rPr>
+              <w:t>。</w:t>
             </w:r>
           </w:p>
         </w:tc>
@@ -4266,12 +4458,16 @@
                 <w:rFonts w:ascii="Times New Roman" w:eastAsia="標楷體" w:hAnsi="Times New Roman" w:cs="Times New Roman"/>
               </w:rPr>
             </w:pPr>
+            <w:proofErr w:type="spellStart"/>
+            <w:proofErr w:type="gramStart"/>
             <w:r>
               <w:rPr>
                 <w:rFonts w:ascii="Times New Roman" w:eastAsia="標楷體" w:hAnsi="Times New Roman" w:cs="Times New Roman" w:hint="eastAsia"/>
               </w:rPr>
               <w:t>Re:Book</w:t>
             </w:r>
+            <w:proofErr w:type="spellEnd"/>
+            <w:proofErr w:type="gramEnd"/>
           </w:p>
         </w:tc>
       </w:tr>
@@ -4390,7 +4586,21 @@
               <w:rPr>
                 <w:rFonts w:ascii="Times New Roman" w:eastAsia="標楷體" w:hAnsi="Times New Roman" w:cs="Times New Roman" w:hint="eastAsia"/>
               </w:rPr>
-              <w:t>買家：希望直接聯繫賣家以詢問書況細節或協商最終價格</w:t>
+              <w:t>買家：希望直接聯繫賣家以詢問書</w:t>
+            </w:r>
+            <w:proofErr w:type="gramStart"/>
+            <w:r>
+              <w:rPr>
+                <w:rFonts w:ascii="Times New Roman" w:eastAsia="標楷體" w:hAnsi="Times New Roman" w:cs="Times New Roman" w:hint="eastAsia"/>
+              </w:rPr>
+              <w:t>況</w:t>
+            </w:r>
+            <w:proofErr w:type="gramEnd"/>
+            <w:r>
+              <w:rPr>
+                <w:rFonts w:ascii="Times New Roman" w:eastAsia="標楷體" w:hAnsi="Times New Roman" w:cs="Times New Roman" w:hint="eastAsia"/>
+              </w:rPr>
+              <w:t>細節或協商最終價格</w:t>
             </w:r>
           </w:p>
           <w:p>
@@ -4609,12 +4819,14 @@
               </w:rPr>
               <w:t>賣家</w:t>
             </w:r>
+            <w:proofErr w:type="gramStart"/>
             <w:r>
               <w:rPr>
                 <w:rFonts w:ascii="Times New Roman" w:eastAsia="標楷體" w:hAnsi="Times New Roman" w:cs="Times New Roman" w:hint="eastAsia"/>
               </w:rPr>
               <w:t>的私訊</w:t>
             </w:r>
+            <w:proofErr w:type="gramEnd"/>
             <w:r>
               <w:rPr>
                 <w:rFonts w:ascii="Times New Roman" w:eastAsia="標楷體" w:hAnsi="Times New Roman" w:cs="Times New Roman" w:hint="eastAsia"/>
@@ -4644,7 +4856,21 @@
               <w:rPr>
                 <w:rFonts w:ascii="Times New Roman" w:eastAsia="標楷體" w:hAnsi="Times New Roman" w:cs="Times New Roman" w:hint="eastAsia"/>
               </w:rPr>
-              <w:t>買家輸入諮詢內容（如：詢問</w:t>
+              <w:t>買家輸入諮詢內容</w:t>
+            </w:r>
+            <w:proofErr w:type="gramStart"/>
+            <w:r>
+              <w:rPr>
+                <w:rFonts w:ascii="Times New Roman" w:eastAsia="標楷體" w:hAnsi="Times New Roman" w:cs="Times New Roman" w:hint="eastAsia"/>
+              </w:rPr>
+              <w:t>（</w:t>
+            </w:r>
+            <w:proofErr w:type="gramEnd"/>
+            <w:r>
+              <w:rPr>
+                <w:rFonts w:ascii="Times New Roman" w:eastAsia="標楷體" w:hAnsi="Times New Roman" w:cs="Times New Roman" w:hint="eastAsia"/>
+              </w:rPr>
+              <w:t>如：詢問</w:t>
             </w:r>
             <w:r>
               <w:rPr>
@@ -4652,11 +4878,33 @@
               </w:rPr>
               <w:t>書</w:t>
             </w:r>
-            <w:r>
-              <w:rPr>
-                <w:rFonts w:ascii="Times New Roman" w:eastAsia="標楷體" w:hAnsi="Times New Roman" w:cs="Times New Roman" w:hint="eastAsia"/>
-              </w:rPr>
-              <w:t>況、議價或約定地點）。</w:t>
+            <w:proofErr w:type="gramStart"/>
+            <w:r>
+              <w:rPr>
+                <w:rFonts w:ascii="Times New Roman" w:eastAsia="標楷體" w:hAnsi="Times New Roman" w:cs="Times New Roman" w:hint="eastAsia"/>
+              </w:rPr>
+              <w:t>況</w:t>
+            </w:r>
+            <w:proofErr w:type="gramEnd"/>
+            <w:r>
+              <w:rPr>
+                <w:rFonts w:ascii="Times New Roman" w:eastAsia="標楷體" w:hAnsi="Times New Roman" w:cs="Times New Roman" w:hint="eastAsia"/>
+              </w:rPr>
+              <w:t>、議價或約定地點</w:t>
+            </w:r>
+            <w:proofErr w:type="gramStart"/>
+            <w:r>
+              <w:rPr>
+                <w:rFonts w:ascii="Times New Roman" w:eastAsia="標楷體" w:hAnsi="Times New Roman" w:cs="Times New Roman" w:hint="eastAsia"/>
+              </w:rPr>
+              <w:t>）</w:t>
+            </w:r>
+            <w:proofErr w:type="gramEnd"/>
+            <w:r>
+              <w:rPr>
+                <w:rFonts w:ascii="Times New Roman" w:eastAsia="標楷體" w:hAnsi="Times New Roman" w:cs="Times New Roman" w:hint="eastAsia"/>
+              </w:rPr>
+              <w:t>。</w:t>
             </w:r>
           </w:p>
           <w:p>
@@ -4889,7 +5137,21 @@
               <w:rPr>
                 <w:rFonts w:ascii="Times New Roman" w:eastAsia="標楷體" w:hAnsi="Times New Roman" w:cs="Times New Roman" w:hint="eastAsia"/>
               </w:rPr>
-              <w:t>支援文字訊息；未來可擴充支援圖片傳送（用於拍攝更詳細的書況）。</w:t>
+              <w:t>支援文字訊息；未來可擴充支援圖片傳送（用於拍攝更詳細的書</w:t>
+            </w:r>
+            <w:proofErr w:type="gramStart"/>
+            <w:r>
+              <w:rPr>
+                <w:rFonts w:ascii="Times New Roman" w:eastAsia="標楷體" w:hAnsi="Times New Roman" w:cs="Times New Roman" w:hint="eastAsia"/>
+              </w:rPr>
+              <w:t>況</w:t>
+            </w:r>
+            <w:proofErr w:type="gramEnd"/>
+            <w:r>
+              <w:rPr>
+                <w:rFonts w:ascii="Times New Roman" w:eastAsia="標楷體" w:hAnsi="Times New Roman" w:cs="Times New Roman" w:hint="eastAsia"/>
+              </w:rPr>
+              <w:t>）。</w:t>
             </w:r>
           </w:p>
         </w:tc>
@@ -5096,12 +5358,16 @@
                 <w:rFonts w:ascii="Times New Roman" w:eastAsia="標楷體" w:hAnsi="Times New Roman" w:cs="Times New Roman"/>
               </w:rPr>
             </w:pPr>
+            <w:proofErr w:type="spellStart"/>
+            <w:proofErr w:type="gramStart"/>
             <w:r>
               <w:rPr>
                 <w:rFonts w:ascii="Times New Roman" w:eastAsia="標楷體" w:hAnsi="Times New Roman" w:cs="Times New Roman" w:hint="eastAsia"/>
               </w:rPr>
               <w:t>Re:Book</w:t>
             </w:r>
+            <w:proofErr w:type="spellEnd"/>
+            <w:proofErr w:type="gramEnd"/>
           </w:p>
         </w:tc>
       </w:tr>
@@ -5393,7 +5659,14 @@
               <w:rPr>
                 <w:rFonts w:ascii="Times New Roman" w:eastAsia="標楷體" w:hAnsi="Times New Roman" w:cs="Times New Roman" w:hint="eastAsia"/>
               </w:rPr>
-              <w:t>被正確歸類至</w:t>
+              <w:t>被正確</w:t>
+            </w:r>
+            <w:proofErr w:type="gramStart"/>
+            <w:r>
+              <w:rPr>
+                <w:rFonts w:ascii="Times New Roman" w:eastAsia="標楷體" w:hAnsi="Times New Roman" w:cs="Times New Roman" w:hint="eastAsia"/>
+              </w:rPr>
+              <w:t>歸類至</w:t>
             </w:r>
             <w:r>
               <w:rPr>
@@ -5401,6 +5674,7 @@
               </w:rPr>
               <w:t>賣家</w:t>
             </w:r>
+            <w:proofErr w:type="gramEnd"/>
             <w:r>
               <w:rPr>
                 <w:rFonts w:ascii="Times New Roman" w:eastAsia="標楷體" w:hAnsi="Times New Roman" w:cs="Times New Roman" w:hint="eastAsia"/>
@@ -5417,7 +5691,21 @@
               <w:rPr>
                 <w:rFonts w:ascii="Times New Roman" w:eastAsia="標楷體" w:hAnsi="Times New Roman" w:cs="Times New Roman" w:hint="eastAsia"/>
               </w:rPr>
-              <w:t>分類中，且買家在賣家個人頁面能看到清楚的分類結構。</w:t>
+              <w:t>分類中，且買家在賣家個人頁面能看到</w:t>
+            </w:r>
+            <w:proofErr w:type="gramStart"/>
+            <w:r>
+              <w:rPr>
+                <w:rFonts w:ascii="Times New Roman" w:eastAsia="標楷體" w:hAnsi="Times New Roman" w:cs="Times New Roman" w:hint="eastAsia"/>
+              </w:rPr>
+              <w:t>清楚的</w:t>
+            </w:r>
+            <w:proofErr w:type="gramEnd"/>
+            <w:r>
+              <w:rPr>
+                <w:rFonts w:ascii="Times New Roman" w:eastAsia="標楷體" w:hAnsi="Times New Roman" w:cs="Times New Roman" w:hint="eastAsia"/>
+              </w:rPr>
+              <w:t>分類結構。</w:t>
             </w:r>
           </w:p>
         </w:tc>
@@ -6226,12 +6514,16 @@
                 <w:rFonts w:ascii="Times New Roman" w:eastAsia="標楷體" w:hAnsi="Times New Roman" w:cs="Times New Roman"/>
               </w:rPr>
             </w:pPr>
+            <w:proofErr w:type="spellStart"/>
+            <w:proofErr w:type="gramStart"/>
             <w:r>
               <w:rPr>
                 <w:rFonts w:ascii="Times New Roman" w:eastAsia="標楷體" w:hAnsi="Times New Roman" w:cs="Times New Roman"/>
               </w:rPr>
               <w:t>Re:Book</w:t>
             </w:r>
+            <w:proofErr w:type="spellEnd"/>
+            <w:proofErr w:type="gramEnd"/>
           </w:p>
         </w:tc>
       </w:tr>
@@ -6520,11 +6812,19 @@
               </w:rPr>
               <w:t>的</w:t>
             </w:r>
-            <w:r>
-              <w:rPr>
-                <w:rFonts w:ascii="Times New Roman" w:eastAsia="標楷體" w:hAnsi="Times New Roman" w:cs="Times New Roman" w:hint="eastAsia"/>
-              </w:rPr>
-              <w:t>詳情頁點擊「加入</w:t>
+            <w:proofErr w:type="gramStart"/>
+            <w:r>
+              <w:rPr>
+                <w:rFonts w:ascii="Times New Roman" w:eastAsia="標楷體" w:hAnsi="Times New Roman" w:cs="Times New Roman" w:hint="eastAsia"/>
+              </w:rPr>
+              <w:t>詳情頁點擊</w:t>
+            </w:r>
+            <w:proofErr w:type="gramEnd"/>
+            <w:r>
+              <w:rPr>
+                <w:rFonts w:ascii="Times New Roman" w:eastAsia="標楷體" w:hAnsi="Times New Roman" w:cs="Times New Roman" w:hint="eastAsia"/>
+              </w:rPr>
+              <w:t>「加入</w:t>
             </w:r>
             <w:r>
               <w:rPr>
@@ -6612,6 +6912,7 @@
               </w:rPr>
               <w:t>買家進入</w:t>
             </w:r>
+            <w:proofErr w:type="gramStart"/>
             <w:r>
               <w:rPr>
                 <w:rFonts w:ascii="Times New Roman" w:eastAsia="標楷體" w:hAnsi="Times New Roman" w:cs="Times New Roman" w:hint="eastAsia"/>
@@ -6622,7 +6923,14 @@
               <w:rPr>
                 <w:rFonts w:ascii="Times New Roman" w:eastAsia="標楷體" w:hAnsi="Times New Roman" w:cs="Times New Roman" w:hint="eastAsia"/>
               </w:rPr>
-              <w:t>頁面，查看所有已</w:t>
+              <w:t>頁面</w:t>
+            </w:r>
+            <w:proofErr w:type="gramEnd"/>
+            <w:r>
+              <w:rPr>
+                <w:rFonts w:ascii="Times New Roman" w:eastAsia="標楷體" w:hAnsi="Times New Roman" w:cs="Times New Roman" w:hint="eastAsia"/>
+              </w:rPr>
+              <w:t>，查看所有已</w:t>
             </w:r>
             <w:r>
               <w:rPr>
@@ -6667,12 +6975,14 @@
               </w:rPr>
               <w:t>買家可從</w:t>
             </w:r>
+            <w:proofErr w:type="gramStart"/>
             <w:r>
               <w:rPr>
                 <w:rFonts w:ascii="Times New Roman" w:eastAsia="標楷體" w:hAnsi="Times New Roman" w:cs="Times New Roman" w:hint="eastAsia"/>
               </w:rPr>
               <w:t>購物車頁面</w:t>
             </w:r>
+            <w:proofErr w:type="gramEnd"/>
             <w:r>
               <w:rPr>
                 <w:rFonts w:ascii="Times New Roman" w:eastAsia="標楷體" w:hAnsi="Times New Roman" w:cs="Times New Roman" w:hint="eastAsia"/>
@@ -7382,11 +7692,19 @@
                 <w:rFonts w:ascii="Times New Roman" w:eastAsia="標楷體" w:hAnsi="Times New Roman" w:cs="Times New Roman"/>
               </w:rPr>
             </w:pPr>
-            <w:r>
-              <w:rPr>
-                <w:rFonts w:ascii="Times New Roman" w:eastAsia="標楷體" w:hAnsi="Times New Roman" w:cs="Times New Roman" w:hint="eastAsia"/>
-              </w:rPr>
-              <w:t>私訊傳遞的延遲時間應小於</w:t>
+            <w:proofErr w:type="gramStart"/>
+            <w:r>
+              <w:rPr>
+                <w:rFonts w:ascii="Times New Roman" w:eastAsia="標楷體" w:hAnsi="Times New Roman" w:cs="Times New Roman" w:hint="eastAsia"/>
+              </w:rPr>
+              <w:t>私訊傳遞</w:t>
+            </w:r>
+            <w:proofErr w:type="gramEnd"/>
+            <w:r>
+              <w:rPr>
+                <w:rFonts w:ascii="Times New Roman" w:eastAsia="標楷體" w:hAnsi="Times New Roman" w:cs="Times New Roman" w:hint="eastAsia"/>
+              </w:rPr>
+              <w:t>的延遲時間應小於</w:t>
             </w:r>
             <w:r>
               <w:rPr>
@@ -7906,7 +8224,21 @@
               <w:rPr>
                 <w:rFonts w:ascii="Times New Roman" w:eastAsia="標楷體" w:hAnsi="Times New Roman" w:cs="Times New Roman"/>
               </w:rPr>
-              <w:t>，包含該書籍的價格、書況、照片與所在地點等資訊。</w:t>
+              <w:t>，包含該書籍的價格、書</w:t>
+            </w:r>
+            <w:proofErr w:type="gramStart"/>
+            <w:r>
+              <w:rPr>
+                <w:rFonts w:ascii="Times New Roman" w:eastAsia="標楷體" w:hAnsi="Times New Roman" w:cs="Times New Roman"/>
+              </w:rPr>
+              <w:t>況</w:t>
+            </w:r>
+            <w:proofErr w:type="gramEnd"/>
+            <w:r>
+              <w:rPr>
+                <w:rFonts w:ascii="Times New Roman" w:eastAsia="標楷體" w:hAnsi="Times New Roman" w:cs="Times New Roman"/>
+              </w:rPr>
+              <w:t>、照片與所在地點等資訊。</w:t>
             </w:r>
           </w:p>
         </w:tc>
@@ -8010,12 +8342,14 @@
                 <w:rFonts w:ascii="Times New Roman" w:eastAsia="標楷體" w:hAnsi="Times New Roman" w:cs="Times New Roman"/>
               </w:rPr>
             </w:pPr>
+            <w:proofErr w:type="gramStart"/>
             <w:r>
               <w:rPr>
                 <w:rFonts w:ascii="Times New Roman" w:eastAsia="標楷體" w:hAnsi="Times New Roman" w:cs="Times New Roman" w:hint="eastAsia"/>
               </w:rPr>
               <w:t>私訊</w:t>
             </w:r>
+            <w:proofErr w:type="gramEnd"/>
           </w:p>
         </w:tc>
         <w:tc>
@@ -8084,12 +8418,20 @@
               </w:rPr>
               <w:t>。讓買家在後續可以進行比價或</w:t>
             </w:r>
+            <w:proofErr w:type="gramStart"/>
             <w:r>
               <w:rPr>
                 <w:rFonts w:ascii="Times New Roman" w:eastAsia="標楷體" w:hAnsi="Times New Roman" w:cs="Times New Roman" w:hint="eastAsia"/>
               </w:rPr>
               <w:lastRenderedPageBreak/>
-              <w:t>發起私訊以進行協商。</w:t>
+              <w:t>發起私訊以</w:t>
+            </w:r>
+            <w:proofErr w:type="gramEnd"/>
+            <w:r>
+              <w:rPr>
+                <w:rFonts w:ascii="Times New Roman" w:eastAsia="標楷體" w:hAnsi="Times New Roman" w:cs="Times New Roman" w:hint="eastAsia"/>
+              </w:rPr>
+              <w:t>進行協商。</w:t>
             </w:r>
           </w:p>
         </w:tc>
@@ -8514,12 +8856,14 @@
                 <w:rFonts w:ascii="Times New Roman" w:eastAsia="標楷體" w:hAnsi="Times New Roman" w:cs="Times New Roman"/>
               </w:rPr>
             </w:pPr>
+            <w:proofErr w:type="gramStart"/>
             <w:r>
               <w:rPr>
                 <w:rFonts w:ascii="Times New Roman" w:eastAsia="標楷體" w:hAnsi="Times New Roman" w:cs="Times New Roman" w:hint="eastAsia"/>
               </w:rPr>
               <w:t>必填欄位</w:t>
             </w:r>
+            <w:proofErr w:type="gramEnd"/>
           </w:p>
         </w:tc>
       </w:tr>
@@ -8556,8 +8900,16 @@
               <w:rPr>
                 <w:rFonts w:ascii="Times New Roman" w:eastAsia="標楷體" w:hAnsi="Times New Roman" w:cs="Times New Roman" w:hint="eastAsia"/>
               </w:rPr>
-              <w:t>書況</w:t>
-            </w:r>
+              <w:t>書</w:t>
+            </w:r>
+            <w:proofErr w:type="gramStart"/>
+            <w:r>
+              <w:rPr>
+                <w:rFonts w:ascii="Times New Roman" w:eastAsia="標楷體" w:hAnsi="Times New Roman" w:cs="Times New Roman" w:hint="eastAsia"/>
+              </w:rPr>
+              <w:t>況</w:t>
+            </w:r>
+            <w:proofErr w:type="gramEnd"/>
           </w:p>
         </w:tc>
         <w:tc>
@@ -8606,12 +8958,14 @@
                 <w:rFonts w:ascii="Times New Roman" w:eastAsia="標楷體" w:hAnsi="Times New Roman" w:cs="Times New Roman"/>
               </w:rPr>
             </w:pPr>
+            <w:proofErr w:type="gramStart"/>
             <w:r>
               <w:rPr>
                 <w:rFonts w:ascii="Times New Roman" w:eastAsia="標楷體" w:hAnsi="Times New Roman" w:cs="Times New Roman" w:hint="eastAsia"/>
               </w:rPr>
               <w:t>私訊</w:t>
             </w:r>
+            <w:proofErr w:type="gramEnd"/>
           </w:p>
         </w:tc>
       </w:tr>
@@ -8846,12 +9200,14 @@
                 <w:rFonts w:ascii="Times New Roman" w:eastAsia="標楷體" w:hAnsi="Times New Roman" w:cs="Times New Roman"/>
               </w:rPr>
             </w:pPr>
+            <w:proofErr w:type="gramStart"/>
             <w:r>
               <w:rPr>
                 <w:rFonts w:ascii="Times New Roman" w:eastAsia="標楷體" w:hAnsi="Times New Roman" w:cs="Times New Roman" w:hint="eastAsia"/>
               </w:rPr>
               <w:t>購物車頁面</w:t>
             </w:r>
+            <w:proofErr w:type="gramEnd"/>
           </w:p>
         </w:tc>
         <w:tc>
@@ -8992,7 +9348,21 @@
         <w:rPr>
           <w:rFonts w:ascii="Times New Roman" w:eastAsia="標楷體" w:hAnsi="Times New Roman" w:cs="Times New Roman" w:hint="eastAsia"/>
         </w:rPr>
-        <w:t>書籍頁面、個人賣場管理頁面、購物車頁面：皆為前端</w:t>
+        <w:t>書籍頁面、個人賣場管理頁面、</w:t>
+      </w:r>
+      <w:proofErr w:type="gramStart"/>
+      <w:r>
+        <w:rPr>
+          <w:rFonts w:ascii="Times New Roman" w:eastAsia="標楷體" w:hAnsi="Times New Roman" w:cs="Times New Roman" w:hint="eastAsia"/>
+        </w:rPr>
+        <w:t>購物車頁面</w:t>
+      </w:r>
+      <w:proofErr w:type="gramEnd"/>
+      <w:r>
+        <w:rPr>
+          <w:rFonts w:ascii="Times New Roman" w:eastAsia="標楷體" w:hAnsi="Times New Roman" w:cs="Times New Roman" w:hint="eastAsia"/>
+        </w:rPr>
+        <w:t>：皆為前端</w:t>
       </w:r>
       <w:r>
         <w:rPr>
@@ -9084,11 +9454,19 @@
           <w:rFonts w:ascii="Times New Roman" w:eastAsia="標楷體" w:hAnsi="Times New Roman" w:cs="Times New Roman"/>
         </w:rPr>
       </w:pPr>
-      <w:r>
-        <w:rPr>
-          <w:rFonts w:ascii="Times New Roman" w:eastAsia="標楷體" w:hAnsi="Times New Roman" w:cs="Times New Roman" w:hint="eastAsia"/>
-        </w:rPr>
-        <w:t>必填欄位：表單驗證規則，非實體物件。</w:t>
+      <w:proofErr w:type="gramStart"/>
+      <w:r>
+        <w:rPr>
+          <w:rFonts w:ascii="Times New Roman" w:eastAsia="標楷體" w:hAnsi="Times New Roman" w:cs="Times New Roman" w:hint="eastAsia"/>
+        </w:rPr>
+        <w:t>必填欄位</w:t>
+      </w:r>
+      <w:proofErr w:type="gramEnd"/>
+      <w:r>
+        <w:rPr>
+          <w:rFonts w:ascii="Times New Roman" w:eastAsia="標楷體" w:hAnsi="Times New Roman" w:cs="Times New Roman" w:hint="eastAsia"/>
+        </w:rPr>
+        <w:t>：表單驗證規則，非實體物件。</w:t>
       </w:r>
     </w:p>
     <w:p>
@@ -9150,7 +9528,21 @@
         <w:rPr>
           <w:rFonts w:ascii="Times New Roman" w:eastAsia="標楷體" w:hAnsi="Times New Roman" w:cs="Times New Roman" w:hint="eastAsia"/>
         </w:rPr>
-        <w:t>書況：應作為</w:t>
+        <w:t>書</w:t>
+      </w:r>
+      <w:proofErr w:type="gramStart"/>
+      <w:r>
+        <w:rPr>
+          <w:rFonts w:ascii="Times New Roman" w:eastAsia="標楷體" w:hAnsi="Times New Roman" w:cs="Times New Roman" w:hint="eastAsia"/>
+        </w:rPr>
+        <w:t>況</w:t>
+      </w:r>
+      <w:proofErr w:type="gramEnd"/>
+      <w:r>
+        <w:rPr>
+          <w:rFonts w:ascii="Times New Roman" w:eastAsia="標楷體" w:hAnsi="Times New Roman" w:cs="Times New Roman" w:hint="eastAsia"/>
+        </w:rPr>
+        <w:t>：應作為</w:t>
       </w:r>
       <w:r>
         <w:rPr>
@@ -9630,12 +10022,14 @@
                 <w:rFonts w:ascii="Times New Roman" w:eastAsia="標楷體" w:hAnsi="Times New Roman" w:cs="Times New Roman"/>
               </w:rPr>
             </w:pPr>
+            <w:proofErr w:type="gramStart"/>
             <w:r>
               <w:rPr>
                 <w:rFonts w:ascii="Times New Roman" w:eastAsia="標楷體" w:hAnsi="Times New Roman" w:cs="Times New Roman" w:hint="eastAsia"/>
               </w:rPr>
               <w:t>私訊</w:t>
             </w:r>
+            <w:proofErr w:type="gramEnd"/>
           </w:p>
         </w:tc>
         <w:tc>
@@ -9768,12 +10162,14 @@
         </w:rPr>
         <w:t>lass</w:t>
       </w:r>
+      <w:proofErr w:type="gramStart"/>
       <w:r>
         <w:rPr>
           <w:rFonts w:ascii="Times New Roman" w:eastAsia="標楷體" w:hAnsi="Times New Roman" w:cs="Times New Roman" w:hint="eastAsia"/>
         </w:rPr>
         <w:t>—</w:t>
       </w:r>
+      <w:proofErr w:type="gramEnd"/>
       <w:r>
         <w:rPr>
           <w:rFonts w:ascii="Times New Roman" w:eastAsia="標楷體" w:hAnsi="Times New Roman" w:cs="Times New Roman" w:hint="eastAsia"/>
@@ -10068,7 +10464,21 @@
               <w:rPr>
                 <w:rFonts w:ascii="Times New Roman" w:eastAsia="標楷體" w:hAnsi="Times New Roman" w:cs="Times New Roman" w:hint="eastAsia"/>
               </w:rPr>
-              <w:t xml:space="preserve"> (BookInfo)</w:t>
+              <w:t xml:space="preserve"> (</w:t>
+            </w:r>
+            <w:proofErr w:type="spellStart"/>
+            <w:r>
+              <w:rPr>
+                <w:rFonts w:ascii="Times New Roman" w:eastAsia="標楷體" w:hAnsi="Times New Roman" w:cs="Times New Roman" w:hint="eastAsia"/>
+              </w:rPr>
+              <w:t>BookInfo</w:t>
+            </w:r>
+            <w:proofErr w:type="spellEnd"/>
+            <w:r>
+              <w:rPr>
+                <w:rFonts w:ascii="Times New Roman" w:eastAsia="標楷體" w:hAnsi="Times New Roman" w:cs="Times New Roman" w:hint="eastAsia"/>
+              </w:rPr>
+              <w:t>)</w:t>
             </w:r>
           </w:p>
         </w:tc>
@@ -10106,12 +10516,14 @@
                 <w:rFonts w:ascii="Times New Roman" w:eastAsia="標楷體" w:hAnsi="Times New Roman" w:cs="Times New Roman"/>
               </w:rPr>
             </w:pPr>
+            <w:proofErr w:type="gramStart"/>
             <w:r>
               <w:rPr>
                 <w:rFonts w:ascii="Times New Roman" w:eastAsia="標楷體" w:hAnsi="Times New Roman" w:cs="Times New Roman" w:hint="eastAsia"/>
               </w:rPr>
               <w:t>私訊</w:t>
             </w:r>
+            <w:proofErr w:type="gramEnd"/>
             <w:r>
               <w:rPr>
                 <w:rFonts w:ascii="Times New Roman" w:eastAsia="標楷體" w:hAnsi="Times New Roman" w:cs="Times New Roman" w:hint="eastAsia"/>
@@ -10218,7 +10630,23 @@
                 <w:rFonts w:ascii="Times New Roman" w:eastAsia="標楷體" w:hAnsi="Times New Roman" w:cs="Times New Roman" w:hint="eastAsia"/>
                 <w:color w:val="FF0000"/>
               </w:rPr>
-              <w:t xml:space="preserve"> (BookStatus)</w:t>
+              <w:t xml:space="preserve"> (</w:t>
+            </w:r>
+            <w:proofErr w:type="spellStart"/>
+            <w:r>
+              <w:rPr>
+                <w:rFonts w:ascii="Times New Roman" w:eastAsia="標楷體" w:hAnsi="Times New Roman" w:cs="Times New Roman" w:hint="eastAsia"/>
+                <w:color w:val="FF0000"/>
+              </w:rPr>
+              <w:t>BookStatus</w:t>
+            </w:r>
+            <w:proofErr w:type="spellEnd"/>
+            <w:r>
+              <w:rPr>
+                <w:rFonts w:ascii="Times New Roman" w:eastAsia="標楷體" w:hAnsi="Times New Roman" w:cs="Times New Roman" w:hint="eastAsia"/>
+                <w:color w:val="FF0000"/>
+              </w:rPr>
+              <w:t>)</w:t>
             </w:r>
           </w:p>
         </w:tc>
@@ -10244,7 +10672,23 @@
                 <w:rFonts w:ascii="Times New Roman" w:eastAsia="標楷體" w:hAnsi="Times New Roman" w:cs="Times New Roman" w:hint="eastAsia"/>
                 <w:color w:val="FF0000"/>
               </w:rPr>
-              <w:t xml:space="preserve"> (OrderStatus)</w:t>
+              <w:t xml:space="preserve"> (</w:t>
+            </w:r>
+            <w:proofErr w:type="spellStart"/>
+            <w:r>
+              <w:rPr>
+                <w:rFonts w:ascii="Times New Roman" w:eastAsia="標楷體" w:hAnsi="Times New Roman" w:cs="Times New Roman" w:hint="eastAsia"/>
+                <w:color w:val="FF0000"/>
+              </w:rPr>
+              <w:t>OrderStatus</w:t>
+            </w:r>
+            <w:proofErr w:type="spellEnd"/>
+            <w:r>
+              <w:rPr>
+                <w:rFonts w:ascii="Times New Roman" w:eastAsia="標楷體" w:hAnsi="Times New Roman" w:cs="Times New Roman" w:hint="eastAsia"/>
+                <w:color w:val="FF0000"/>
+              </w:rPr>
+              <w:t>)</w:t>
             </w:r>
           </w:p>
         </w:tc>
@@ -10697,58 +11141,25 @@
     <w:p>
       <w:pPr>
         <w:widowControl/>
+        <w:jc w:val="center"/>
         <w:rPr>
           <w:rFonts w:ascii="Times New Roman" w:eastAsia="標楷體" w:hAnsi="Times New Roman" w:cs="Times New Roman"/>
           <w:sz w:val="22"/>
           <w:szCs w:val="22"/>
         </w:rPr>
       </w:pPr>
-    </w:p>
-    <w:p>
-      <w:pPr>
-        <w:pStyle w:val="2"/>
-      </w:pPr>
-      <w:r>
-        <w:rPr>
-          <w:rFonts w:hint="eastAsia"/>
-        </w:rPr>
-        <w:t>3.2 Use-Case Realizations with GRASP Patterns</w:t>
-      </w:r>
-    </w:p>
-    <w:p>
-      <w:pPr>
-        <w:widowControl/>
-        <w:rPr>
-          <w:rFonts w:ascii="Times New Roman" w:eastAsia="標楷體" w:hAnsi="Times New Roman" w:cs="Times New Roman" w:hint="eastAsia"/>
+      <w:r>
+        <w:rPr>
+          <w:rFonts w:ascii="Times New Roman" w:eastAsia="標楷體" w:hAnsi="Times New Roman" w:cs="Times New Roman"/>
+          <w:noProof/>
           <w:sz w:val="22"/>
           <w:szCs w:val="22"/>
         </w:rPr>
-      </w:pPr>
-    </w:p>
-    <w:p>
-      <w:pPr>
-        <w:pStyle w:val="2"/>
-      </w:pPr>
-      <w:r>
-        <w:rPr>
-          <w:rFonts w:hint="eastAsia"/>
-        </w:rPr>
-        <w:t>3.3 Design Class Diagram</w:t>
-      </w:r>
-    </w:p>
-    <w:p>
-      <w:pPr>
-        <w:jc w:val="center"/>
-      </w:pPr>
-      <w:r>
-        <w:rPr>
-          <w:noProof/>
-        </w:rPr>
         <w:drawing>
-          <wp:inline distT="0" distB="0" distL="0" distR="0" wp14:anchorId="6C337E4A" wp14:editId="5D36C362">
-            <wp:extent cx="5274310" cy="1978660"/>
-            <wp:effectExtent l="0" t="0" r="2540" b="2540"/>
-            <wp:docPr id="2" name="圖片 2"/>
+          <wp:inline distT="0" distB="0" distL="0" distR="0" wp14:anchorId="295E9179" wp14:editId="467EB673">
+            <wp:extent cx="2939403" cy="4203700"/>
+            <wp:effectExtent l="0" t="0" r="0" b="6350"/>
+            <wp:docPr id="7" name="圖片 7"/>
             <wp:cNvGraphicFramePr>
               <a:graphicFrameLocks xmlns:a="http://schemas.openxmlformats.org/drawingml/2006/main" noChangeAspect="1"/>
             </wp:cNvGraphicFramePr>
@@ -10756,7 +11167,7 @@
               <a:graphicData uri="http://schemas.openxmlformats.org/drawingml/2006/picture">
                 <pic:pic xmlns:pic="http://schemas.openxmlformats.org/drawingml/2006/picture">
                   <pic:nvPicPr>
-                    <pic:cNvPr id="0" name="Picture 1"/>
+                    <pic:cNvPr id="0" name="Picture 12"/>
                     <pic:cNvPicPr>
                       <a:picLocks noChangeAspect="1" noChangeArrowheads="1"/>
                     </pic:cNvPicPr>
@@ -10777,7 +11188,7 @@
                   <pic:spPr bwMode="auto">
                     <a:xfrm>
                       <a:off x="0" y="0"/>
-                      <a:ext cx="5274310" cy="1978660"/>
+                      <a:ext cx="2956445" cy="4228072"/>
                     </a:xfrm>
                     <a:prstGeom prst="rect">
                       <a:avLst/>
@@ -10841,11 +11252,11 @@
           <w:sz w:val="22"/>
           <w:szCs w:val="22"/>
         </w:rPr>
-        <w:t>-</w:t>
-      </w:r>
-      <w:r>
-        <w:rPr>
-          <w:rFonts w:ascii="Times New Roman" w:eastAsia="標楷體" w:hAnsi="Times New Roman" w:cs="Times New Roman" w:hint="eastAsia"/>
+        <w:t xml:space="preserve">-1 </w:t>
+      </w:r>
+      <w:r>
+        <w:rPr>
+          <w:rFonts w:ascii="Times New Roman" w:eastAsia="標楷體" w:hAnsi="Times New Roman" w:cs="Times New Roman"/>
           <w:b/>
           <w:bCs/>
           <w:i/>
@@ -10853,15 +11264,1593 @@
           <w:sz w:val="22"/>
           <w:szCs w:val="22"/>
         </w:rPr>
-        <w:t>12 Design Class Model</w:t>
+        <w:t xml:space="preserve">Logical Architecture </w:t>
+      </w:r>
+      <w:r>
+        <w:rPr>
+          <w:rFonts w:ascii="Times New Roman" w:eastAsia="標楷體" w:hAnsi="Times New Roman" w:cs="Times New Roman"/>
+          <w:b/>
+          <w:bCs/>
+          <w:i/>
+          <w:iCs/>
+          <w:sz w:val="22"/>
+          <w:szCs w:val="22"/>
+        </w:rPr>
+        <w:t>Diagram</w:t>
       </w:r>
     </w:p>
     <w:p>
       <w:pPr>
+        <w:pStyle w:val="2"/>
+      </w:pPr>
+      <w:r>
+        <w:rPr>
+          <w:rFonts w:hint="eastAsia"/>
+        </w:rPr>
+        <w:t>3.2 Use-Case Realizations with GRASP Patterns</w:t>
+      </w:r>
+    </w:p>
+    <w:p>
+      <w:pPr>
+        <w:pStyle w:val="3"/>
+      </w:pPr>
+      <w:r>
+        <w:rPr>
+          <w:rFonts w:hint="eastAsia"/>
+          <w:sz w:val="24"/>
+          <w:szCs w:val="24"/>
+        </w:rPr>
+        <w:t>3.2.1 S</w:t>
+      </w:r>
+      <w:r>
+        <w:rPr>
+          <w:rFonts w:hint="eastAsia"/>
+        </w:rPr>
+        <w:t>ystem Sequence Diagram</w:t>
+      </w:r>
+    </w:p>
+    <w:p>
+      <w:pPr>
+        <w:widowControl/>
         <w:jc w:val="center"/>
         <w:rPr>
+          <w:rFonts w:ascii="Times New Roman" w:eastAsia="標楷體" w:hAnsi="Times New Roman" w:cs="Times New Roman"/>
+        </w:rPr>
+      </w:pPr>
+      <w:r>
+        <w:rPr>
+          <w:noProof/>
+        </w:rPr>
+        <w:drawing>
+          <wp:inline distT="0" distB="0" distL="0" distR="0" wp14:anchorId="5159E7D1" wp14:editId="7B73081F">
+            <wp:extent cx="3619916" cy="1536700"/>
+            <wp:effectExtent l="0" t="0" r="0" b="6350"/>
+            <wp:docPr id="2005860709" name="圖片 1"/>
+            <wp:cNvGraphicFramePr>
+              <a:graphicFrameLocks xmlns:a="http://schemas.openxmlformats.org/drawingml/2006/main" noChangeAspect="1"/>
+            </wp:cNvGraphicFramePr>
+            <a:graphic xmlns:a="http://schemas.openxmlformats.org/drawingml/2006/main">
+              <a:graphicData uri="http://schemas.openxmlformats.org/drawingml/2006/picture">
+                <pic:pic xmlns:pic="http://schemas.openxmlformats.org/drawingml/2006/picture">
+                  <pic:nvPicPr>
+                    <pic:cNvPr id="2005860709" name=""/>
+                    <pic:cNvPicPr/>
+                  </pic:nvPicPr>
+                  <pic:blipFill>
+                    <a:blip r:embed="rId12"/>
+                    <a:stretch>
+                      <a:fillRect/>
+                    </a:stretch>
+                  </pic:blipFill>
+                  <pic:spPr>
+                    <a:xfrm>
+                      <a:off x="0" y="0"/>
+                      <a:ext cx="3674660" cy="1559940"/>
+                    </a:xfrm>
+                    <a:prstGeom prst="rect">
+                      <a:avLst/>
+                    </a:prstGeom>
+                  </pic:spPr>
+                </pic:pic>
+              </a:graphicData>
+            </a:graphic>
+          </wp:inline>
+        </w:drawing>
+      </w:r>
+    </w:p>
+    <w:p>
+      <w:pPr>
+        <w:jc w:val="center"/>
+        <w:rPr>
+          <w:rFonts w:ascii="Times New Roman" w:eastAsia="標楷體" w:hAnsi="Times New Roman" w:cs="Times New Roman"/>
+          <w:b/>
+          <w:bCs/>
+          <w:i/>
+          <w:iCs/>
+          <w:sz w:val="22"/>
+          <w:szCs w:val="22"/>
+        </w:rPr>
+      </w:pPr>
+      <w:r>
+        <w:rPr>
+          <w:rFonts w:ascii="Times New Roman" w:eastAsia="標楷體" w:hAnsi="Times New Roman" w:cs="Times New Roman" w:hint="eastAsia"/>
+          <w:b/>
+          <w:bCs/>
+          <w:i/>
+          <w:iCs/>
+          <w:sz w:val="22"/>
+          <w:szCs w:val="22"/>
+        </w:rPr>
+        <w:t xml:space="preserve">Figure </w:t>
+      </w:r>
+      <w:r>
+        <w:rPr>
+          <w:rFonts w:ascii="Times New Roman" w:eastAsia="標楷體" w:hAnsi="Times New Roman" w:cs="Times New Roman" w:hint="eastAsia"/>
+          <w:b/>
+          <w:bCs/>
+          <w:i/>
+          <w:iCs/>
+          <w:sz w:val="22"/>
+          <w:szCs w:val="22"/>
+        </w:rPr>
+        <w:t>3</w:t>
+      </w:r>
+      <w:r>
+        <w:rPr>
+          <w:rFonts w:ascii="Times New Roman" w:eastAsia="標楷體" w:hAnsi="Times New Roman" w:cs="Times New Roman" w:hint="eastAsia"/>
+          <w:b/>
+          <w:bCs/>
+          <w:i/>
+          <w:iCs/>
+          <w:sz w:val="22"/>
+          <w:szCs w:val="22"/>
+        </w:rPr>
+        <w:t>-</w:t>
+      </w:r>
+      <w:r>
+        <w:rPr>
+          <w:rFonts w:ascii="Times New Roman" w:eastAsia="標楷體" w:hAnsi="Times New Roman" w:cs="Times New Roman" w:hint="eastAsia"/>
+          <w:b/>
+          <w:bCs/>
+          <w:i/>
+          <w:iCs/>
+          <w:sz w:val="22"/>
+          <w:szCs w:val="22"/>
+        </w:rPr>
+        <w:t>2</w:t>
+      </w:r>
+      <w:r>
+        <w:rPr>
+          <w:rFonts w:ascii="Times New Roman" w:eastAsia="標楷體" w:hAnsi="Times New Roman" w:cs="Times New Roman" w:hint="eastAsia"/>
+          <w:b/>
+          <w:bCs/>
+          <w:i/>
+          <w:iCs/>
+          <w:sz w:val="22"/>
+          <w:szCs w:val="22"/>
+        </w:rPr>
+        <w:t xml:space="preserve"> </w:t>
+      </w:r>
+      <w:r>
+        <w:rPr>
+          <w:rFonts w:ascii="Times New Roman" w:eastAsia="標楷體" w:hAnsi="Times New Roman" w:cs="Times New Roman" w:hint="eastAsia"/>
+          <w:b/>
+          <w:bCs/>
+          <w:i/>
+          <w:iCs/>
+          <w:sz w:val="22"/>
+          <w:szCs w:val="22"/>
+        </w:rPr>
+        <w:t>System Sequence Diagram of FEA-03</w:t>
+      </w:r>
+    </w:p>
+    <w:p>
+      <w:pPr>
+        <w:jc w:val="center"/>
+        <w:rPr>
+          <w:rFonts w:ascii="Times New Roman" w:eastAsia="標楷體" w:hAnsi="Times New Roman" w:cs="Times New Roman"/>
+          <w:sz w:val="22"/>
+          <w:szCs w:val="22"/>
+        </w:rPr>
+      </w:pPr>
+      <w:r>
+        <w:rPr>
+          <w:noProof/>
+        </w:rPr>
+        <w:lastRenderedPageBreak/>
+        <w:drawing>
+          <wp:inline distT="0" distB="0" distL="0" distR="0" wp14:anchorId="09F3EFBB" wp14:editId="74F8C009">
+            <wp:extent cx="3575050" cy="1602014"/>
+            <wp:effectExtent l="0" t="0" r="6350" b="0"/>
+            <wp:docPr id="397868409" name="圖片 1"/>
+            <wp:cNvGraphicFramePr>
+              <a:graphicFrameLocks xmlns:a="http://schemas.openxmlformats.org/drawingml/2006/main" noChangeAspect="1"/>
+            </wp:cNvGraphicFramePr>
+            <a:graphic xmlns:a="http://schemas.openxmlformats.org/drawingml/2006/main">
+              <a:graphicData uri="http://schemas.openxmlformats.org/drawingml/2006/picture">
+                <pic:pic xmlns:pic="http://schemas.openxmlformats.org/drawingml/2006/picture">
+                  <pic:nvPicPr>
+                    <pic:cNvPr id="397868409" name=""/>
+                    <pic:cNvPicPr/>
+                  </pic:nvPicPr>
+                  <pic:blipFill>
+                    <a:blip r:embed="rId13"/>
+                    <a:stretch>
+                      <a:fillRect/>
+                    </a:stretch>
+                  </pic:blipFill>
+                  <pic:spPr>
+                    <a:xfrm>
+                      <a:off x="0" y="0"/>
+                      <a:ext cx="3644655" cy="1633205"/>
+                    </a:xfrm>
+                    <a:prstGeom prst="rect">
+                      <a:avLst/>
+                    </a:prstGeom>
+                  </pic:spPr>
+                </pic:pic>
+              </a:graphicData>
+            </a:graphic>
+          </wp:inline>
+        </w:drawing>
+      </w:r>
+    </w:p>
+    <w:p>
+      <w:pPr>
+        <w:jc w:val="center"/>
+        <w:rPr>
+          <w:rFonts w:ascii="Times New Roman" w:eastAsia="標楷體" w:hAnsi="Times New Roman" w:cs="Times New Roman"/>
+          <w:b/>
+          <w:bCs/>
+          <w:i/>
+          <w:iCs/>
+          <w:sz w:val="22"/>
+          <w:szCs w:val="22"/>
+        </w:rPr>
+      </w:pPr>
+      <w:r>
+        <w:rPr>
+          <w:rFonts w:ascii="Times New Roman" w:eastAsia="標楷體" w:hAnsi="Times New Roman" w:cs="Times New Roman" w:hint="eastAsia"/>
+          <w:b/>
+          <w:bCs/>
+          <w:i/>
+          <w:iCs/>
+          <w:sz w:val="22"/>
+          <w:szCs w:val="22"/>
+        </w:rPr>
+        <w:t xml:space="preserve">Figure </w:t>
+      </w:r>
+      <w:r>
+        <w:rPr>
+          <w:rFonts w:ascii="Times New Roman" w:eastAsia="標楷體" w:hAnsi="Times New Roman" w:cs="Times New Roman" w:hint="eastAsia"/>
+          <w:b/>
+          <w:bCs/>
+          <w:i/>
+          <w:iCs/>
+          <w:sz w:val="22"/>
+          <w:szCs w:val="22"/>
+        </w:rPr>
+        <w:t>3</w:t>
+      </w:r>
+      <w:r>
+        <w:rPr>
+          <w:rFonts w:ascii="Times New Roman" w:eastAsia="標楷體" w:hAnsi="Times New Roman" w:cs="Times New Roman" w:hint="eastAsia"/>
+          <w:b/>
+          <w:bCs/>
+          <w:i/>
+          <w:iCs/>
+          <w:sz w:val="22"/>
+          <w:szCs w:val="22"/>
+        </w:rPr>
+        <w:t>-</w:t>
+      </w:r>
+      <w:r>
+        <w:rPr>
+          <w:rFonts w:ascii="Times New Roman" w:eastAsia="標楷體" w:hAnsi="Times New Roman" w:cs="Times New Roman" w:hint="eastAsia"/>
+          <w:b/>
+          <w:bCs/>
+          <w:i/>
+          <w:iCs/>
+          <w:sz w:val="22"/>
+          <w:szCs w:val="22"/>
+        </w:rPr>
+        <w:t>3</w:t>
+      </w:r>
+      <w:r>
+        <w:rPr>
+          <w:rFonts w:ascii="Times New Roman" w:eastAsia="標楷體" w:hAnsi="Times New Roman" w:cs="Times New Roman" w:hint="eastAsia"/>
+          <w:b/>
+          <w:bCs/>
+          <w:i/>
+          <w:iCs/>
+          <w:sz w:val="22"/>
+          <w:szCs w:val="22"/>
+        </w:rPr>
+        <w:t xml:space="preserve"> </w:t>
+      </w:r>
+      <w:r>
+        <w:rPr>
+          <w:rFonts w:ascii="Times New Roman" w:eastAsia="標楷體" w:hAnsi="Times New Roman" w:cs="Times New Roman" w:hint="eastAsia"/>
+          <w:b/>
+          <w:bCs/>
+          <w:i/>
+          <w:iCs/>
+          <w:sz w:val="22"/>
+          <w:szCs w:val="22"/>
+        </w:rPr>
+        <w:t>System Sequence Diagram of FEA-01: add book</w:t>
+      </w:r>
+    </w:p>
+    <w:p>
+      <w:pPr>
+        <w:jc w:val="center"/>
+        <w:rPr>
+          <w:rFonts w:ascii="Times New Roman" w:eastAsia="標楷體" w:hAnsi="Times New Roman" w:cs="Times New Roman"/>
+          <w:sz w:val="22"/>
+          <w:szCs w:val="22"/>
+        </w:rPr>
+      </w:pPr>
+      <w:r>
+        <w:rPr>
+          <w:noProof/>
+        </w:rPr>
+        <w:drawing>
+          <wp:inline distT="0" distB="0" distL="0" distR="0" wp14:anchorId="4A5F58B6" wp14:editId="45737C87">
+            <wp:extent cx="3568700" cy="1599169"/>
+            <wp:effectExtent l="0" t="0" r="0" b="1270"/>
+            <wp:docPr id="1635343776" name="圖片 1"/>
+            <wp:cNvGraphicFramePr>
+              <a:graphicFrameLocks xmlns:a="http://schemas.openxmlformats.org/drawingml/2006/main" noChangeAspect="1"/>
+            </wp:cNvGraphicFramePr>
+            <a:graphic xmlns:a="http://schemas.openxmlformats.org/drawingml/2006/main">
+              <a:graphicData uri="http://schemas.openxmlformats.org/drawingml/2006/picture">
+                <pic:pic xmlns:pic="http://schemas.openxmlformats.org/drawingml/2006/picture">
+                  <pic:nvPicPr>
+                    <pic:cNvPr id="1635343776" name=""/>
+                    <pic:cNvPicPr/>
+                  </pic:nvPicPr>
+                  <pic:blipFill>
+                    <a:blip r:embed="rId14"/>
+                    <a:stretch>
+                      <a:fillRect/>
+                    </a:stretch>
+                  </pic:blipFill>
+                  <pic:spPr>
+                    <a:xfrm>
+                      <a:off x="0" y="0"/>
+                      <a:ext cx="3598947" cy="1612723"/>
+                    </a:xfrm>
+                    <a:prstGeom prst="rect">
+                      <a:avLst/>
+                    </a:prstGeom>
+                  </pic:spPr>
+                </pic:pic>
+              </a:graphicData>
+            </a:graphic>
+          </wp:inline>
+        </w:drawing>
+      </w:r>
+    </w:p>
+    <w:p>
+      <w:pPr>
+        <w:jc w:val="center"/>
+        <w:rPr>
+          <w:rFonts w:ascii="Times New Roman" w:eastAsia="標楷體" w:hAnsi="Times New Roman" w:cs="Times New Roman"/>
+          <w:b/>
+          <w:bCs/>
+          <w:i/>
+          <w:iCs/>
+          <w:sz w:val="22"/>
+          <w:szCs w:val="22"/>
+        </w:rPr>
+      </w:pPr>
+      <w:r>
+        <w:rPr>
+          <w:rFonts w:ascii="Times New Roman" w:eastAsia="標楷體" w:hAnsi="Times New Roman" w:cs="Times New Roman" w:hint="eastAsia"/>
+          <w:b/>
+          <w:bCs/>
+          <w:i/>
+          <w:iCs/>
+          <w:sz w:val="22"/>
+          <w:szCs w:val="22"/>
+        </w:rPr>
+        <w:t xml:space="preserve">Figure </w:t>
+      </w:r>
+      <w:r>
+        <w:rPr>
+          <w:rFonts w:ascii="Times New Roman" w:eastAsia="標楷體" w:hAnsi="Times New Roman" w:cs="Times New Roman" w:hint="eastAsia"/>
+          <w:b/>
+          <w:bCs/>
+          <w:i/>
+          <w:iCs/>
+          <w:sz w:val="22"/>
+          <w:szCs w:val="22"/>
+        </w:rPr>
+        <w:t>3</w:t>
+      </w:r>
+      <w:r>
+        <w:rPr>
+          <w:rFonts w:ascii="Times New Roman" w:eastAsia="標楷體" w:hAnsi="Times New Roman" w:cs="Times New Roman" w:hint="eastAsia"/>
+          <w:b/>
+          <w:bCs/>
+          <w:i/>
+          <w:iCs/>
+          <w:sz w:val="22"/>
+          <w:szCs w:val="22"/>
+        </w:rPr>
+        <w:t>-</w:t>
+      </w:r>
+      <w:r>
+        <w:rPr>
+          <w:rFonts w:ascii="Times New Roman" w:eastAsia="標楷體" w:hAnsi="Times New Roman" w:cs="Times New Roman" w:hint="eastAsia"/>
+          <w:b/>
+          <w:bCs/>
+          <w:i/>
+          <w:iCs/>
+          <w:sz w:val="22"/>
+          <w:szCs w:val="22"/>
+        </w:rPr>
+        <w:t>4</w:t>
+      </w:r>
+      <w:r>
+        <w:rPr>
+          <w:rFonts w:ascii="Times New Roman" w:eastAsia="標楷體" w:hAnsi="Times New Roman" w:cs="Times New Roman" w:hint="eastAsia"/>
+          <w:b/>
+          <w:bCs/>
+          <w:i/>
+          <w:iCs/>
+          <w:sz w:val="22"/>
+          <w:szCs w:val="22"/>
+        </w:rPr>
+        <w:t xml:space="preserve"> </w:t>
+      </w:r>
+      <w:r>
+        <w:rPr>
+          <w:rFonts w:ascii="Times New Roman" w:eastAsia="標楷體" w:hAnsi="Times New Roman" w:cs="Times New Roman" w:hint="eastAsia"/>
+          <w:b/>
+          <w:bCs/>
+          <w:i/>
+          <w:iCs/>
+          <w:sz w:val="22"/>
+          <w:szCs w:val="22"/>
+        </w:rPr>
+        <w:t>System Sequence Diagram of FEA-01: view book list</w:t>
+      </w:r>
+    </w:p>
+    <w:p>
+      <w:pPr>
+        <w:jc w:val="center"/>
+        <w:rPr>
+          <w:rFonts w:ascii="Times New Roman" w:eastAsia="標楷體" w:hAnsi="Times New Roman" w:cs="Times New Roman"/>
+          <w:sz w:val="22"/>
+          <w:szCs w:val="22"/>
+        </w:rPr>
+      </w:pPr>
+      <w:r>
+        <w:rPr>
+          <w:noProof/>
+        </w:rPr>
+        <w:drawing>
+          <wp:inline distT="0" distB="0" distL="0" distR="0" wp14:anchorId="4B63E149" wp14:editId="64C93A87">
+            <wp:extent cx="3585171" cy="1606550"/>
+            <wp:effectExtent l="0" t="0" r="0" b="0"/>
+            <wp:docPr id="1586646722" name="圖片 1"/>
+            <wp:cNvGraphicFramePr>
+              <a:graphicFrameLocks xmlns:a="http://schemas.openxmlformats.org/drawingml/2006/main" noChangeAspect="1"/>
+            </wp:cNvGraphicFramePr>
+            <a:graphic xmlns:a="http://schemas.openxmlformats.org/drawingml/2006/main">
+              <a:graphicData uri="http://schemas.openxmlformats.org/drawingml/2006/picture">
+                <pic:pic xmlns:pic="http://schemas.openxmlformats.org/drawingml/2006/picture">
+                  <pic:nvPicPr>
+                    <pic:cNvPr id="1586646722" name=""/>
+                    <pic:cNvPicPr/>
+                  </pic:nvPicPr>
+                  <pic:blipFill>
+                    <a:blip r:embed="rId15"/>
+                    <a:stretch>
+                      <a:fillRect/>
+                    </a:stretch>
+                  </pic:blipFill>
+                  <pic:spPr>
+                    <a:xfrm>
+                      <a:off x="0" y="0"/>
+                      <a:ext cx="3643292" cy="1632594"/>
+                    </a:xfrm>
+                    <a:prstGeom prst="rect">
+                      <a:avLst/>
+                    </a:prstGeom>
+                  </pic:spPr>
+                </pic:pic>
+              </a:graphicData>
+            </a:graphic>
+          </wp:inline>
+        </w:drawing>
+      </w:r>
+    </w:p>
+    <w:p>
+      <w:pPr>
+        <w:jc w:val="center"/>
+        <w:rPr>
+          <w:rFonts w:ascii="Times New Roman" w:eastAsia="標楷體" w:hAnsi="Times New Roman" w:cs="Times New Roman"/>
+          <w:b/>
+          <w:bCs/>
+          <w:i/>
+          <w:iCs/>
+          <w:sz w:val="22"/>
+          <w:szCs w:val="22"/>
+        </w:rPr>
+      </w:pPr>
+      <w:r>
+        <w:rPr>
+          <w:rFonts w:ascii="Times New Roman" w:eastAsia="標楷體" w:hAnsi="Times New Roman" w:cs="Times New Roman" w:hint="eastAsia"/>
+          <w:b/>
+          <w:bCs/>
+          <w:i/>
+          <w:iCs/>
+          <w:sz w:val="22"/>
+          <w:szCs w:val="22"/>
+        </w:rPr>
+        <w:t xml:space="preserve">Figure </w:t>
+      </w:r>
+      <w:r>
+        <w:rPr>
+          <w:rFonts w:ascii="Times New Roman" w:eastAsia="標楷體" w:hAnsi="Times New Roman" w:cs="Times New Roman" w:hint="eastAsia"/>
+          <w:b/>
+          <w:bCs/>
+          <w:i/>
+          <w:iCs/>
+          <w:sz w:val="22"/>
+          <w:szCs w:val="22"/>
+        </w:rPr>
+        <w:t>3</w:t>
+      </w:r>
+      <w:r>
+        <w:rPr>
+          <w:rFonts w:ascii="Times New Roman" w:eastAsia="標楷體" w:hAnsi="Times New Roman" w:cs="Times New Roman" w:hint="eastAsia"/>
+          <w:b/>
+          <w:bCs/>
+          <w:i/>
+          <w:iCs/>
+          <w:sz w:val="22"/>
+          <w:szCs w:val="22"/>
+        </w:rPr>
+        <w:t>-</w:t>
+      </w:r>
+      <w:r>
+        <w:rPr>
+          <w:rFonts w:ascii="Times New Roman" w:eastAsia="標楷體" w:hAnsi="Times New Roman" w:cs="Times New Roman" w:hint="eastAsia"/>
+          <w:b/>
+          <w:bCs/>
+          <w:i/>
+          <w:iCs/>
+          <w:sz w:val="22"/>
+          <w:szCs w:val="22"/>
+        </w:rPr>
+        <w:t>5</w:t>
+      </w:r>
+      <w:r>
+        <w:rPr>
+          <w:rFonts w:ascii="Times New Roman" w:eastAsia="標楷體" w:hAnsi="Times New Roman" w:cs="Times New Roman" w:hint="eastAsia"/>
+          <w:b/>
+          <w:bCs/>
+          <w:i/>
+          <w:iCs/>
+          <w:sz w:val="22"/>
+          <w:szCs w:val="22"/>
+        </w:rPr>
+        <w:t xml:space="preserve"> </w:t>
+      </w:r>
+      <w:r>
+        <w:rPr>
+          <w:rFonts w:ascii="Times New Roman" w:eastAsia="標楷體" w:hAnsi="Times New Roman" w:cs="Times New Roman" w:hint="eastAsia"/>
+          <w:b/>
+          <w:bCs/>
+          <w:i/>
+          <w:iCs/>
+          <w:sz w:val="22"/>
+          <w:szCs w:val="22"/>
+        </w:rPr>
+        <w:t>System Sequence Diagram of FEA-01: update book</w:t>
+      </w:r>
+    </w:p>
+    <w:p>
+      <w:pPr>
+        <w:jc w:val="center"/>
+        <w:rPr>
+          <w:rFonts w:ascii="Times New Roman" w:eastAsia="標楷體" w:hAnsi="Times New Roman" w:cs="Times New Roman"/>
+          <w:sz w:val="22"/>
+          <w:szCs w:val="22"/>
+        </w:rPr>
+      </w:pPr>
+      <w:r>
+        <w:rPr>
+          <w:noProof/>
+        </w:rPr>
+        <w:drawing>
+          <wp:inline distT="0" distB="0" distL="0" distR="0" wp14:anchorId="5FFD894C" wp14:editId="1ABBA7ED">
+            <wp:extent cx="3599344" cy="1612900"/>
+            <wp:effectExtent l="0" t="0" r="1270" b="6350"/>
+            <wp:docPr id="353923455" name="圖片 1"/>
+            <wp:cNvGraphicFramePr>
+              <a:graphicFrameLocks xmlns:a="http://schemas.openxmlformats.org/drawingml/2006/main" noChangeAspect="1"/>
+            </wp:cNvGraphicFramePr>
+            <a:graphic xmlns:a="http://schemas.openxmlformats.org/drawingml/2006/main">
+              <a:graphicData uri="http://schemas.openxmlformats.org/drawingml/2006/picture">
+                <pic:pic xmlns:pic="http://schemas.openxmlformats.org/drawingml/2006/picture">
+                  <pic:nvPicPr>
+                    <pic:cNvPr id="353923455" name=""/>
+                    <pic:cNvPicPr/>
+                  </pic:nvPicPr>
+                  <pic:blipFill>
+                    <a:blip r:embed="rId16"/>
+                    <a:stretch>
+                      <a:fillRect/>
+                    </a:stretch>
+                  </pic:blipFill>
+                  <pic:spPr>
+                    <a:xfrm>
+                      <a:off x="0" y="0"/>
+                      <a:ext cx="3642706" cy="1632331"/>
+                    </a:xfrm>
+                    <a:prstGeom prst="rect">
+                      <a:avLst/>
+                    </a:prstGeom>
+                  </pic:spPr>
+                </pic:pic>
+              </a:graphicData>
+            </a:graphic>
+          </wp:inline>
+        </w:drawing>
+      </w:r>
+    </w:p>
+    <w:p>
+      <w:pPr>
+        <w:jc w:val="center"/>
+      </w:pPr>
+      <w:r>
+        <w:rPr>
+          <w:rFonts w:ascii="Times New Roman" w:eastAsia="標楷體" w:hAnsi="Times New Roman" w:cs="Times New Roman" w:hint="eastAsia"/>
+          <w:b/>
+          <w:bCs/>
+          <w:i/>
+          <w:iCs/>
+          <w:sz w:val="22"/>
+          <w:szCs w:val="22"/>
+        </w:rPr>
+        <w:t xml:space="preserve">Figure </w:t>
+      </w:r>
+      <w:r>
+        <w:rPr>
+          <w:rFonts w:ascii="Times New Roman" w:eastAsia="標楷體" w:hAnsi="Times New Roman" w:cs="Times New Roman" w:hint="eastAsia"/>
+          <w:b/>
+          <w:bCs/>
+          <w:i/>
+          <w:iCs/>
+          <w:sz w:val="22"/>
+          <w:szCs w:val="22"/>
+        </w:rPr>
+        <w:t>3</w:t>
+      </w:r>
+      <w:r>
+        <w:rPr>
+          <w:rFonts w:ascii="Times New Roman" w:eastAsia="標楷體" w:hAnsi="Times New Roman" w:cs="Times New Roman" w:hint="eastAsia"/>
+          <w:b/>
+          <w:bCs/>
+          <w:i/>
+          <w:iCs/>
+          <w:sz w:val="22"/>
+          <w:szCs w:val="22"/>
+        </w:rPr>
+        <w:t>-</w:t>
+      </w:r>
+      <w:r>
+        <w:rPr>
+          <w:rFonts w:ascii="Times New Roman" w:eastAsia="標楷體" w:hAnsi="Times New Roman" w:cs="Times New Roman" w:hint="eastAsia"/>
+          <w:b/>
+          <w:bCs/>
+          <w:i/>
+          <w:iCs/>
+          <w:sz w:val="22"/>
+          <w:szCs w:val="22"/>
+        </w:rPr>
+        <w:t>6</w:t>
+      </w:r>
+      <w:r>
+        <w:rPr>
+          <w:rFonts w:ascii="Times New Roman" w:eastAsia="標楷體" w:hAnsi="Times New Roman" w:cs="Times New Roman" w:hint="eastAsia"/>
+          <w:b/>
+          <w:bCs/>
+          <w:i/>
+          <w:iCs/>
+          <w:sz w:val="22"/>
+          <w:szCs w:val="22"/>
+        </w:rPr>
+        <w:t xml:space="preserve"> </w:t>
+      </w:r>
+      <w:r>
+        <w:rPr>
+          <w:rFonts w:ascii="Times New Roman" w:eastAsia="標楷體" w:hAnsi="Times New Roman" w:cs="Times New Roman" w:hint="eastAsia"/>
+          <w:b/>
+          <w:bCs/>
+          <w:i/>
+          <w:iCs/>
+          <w:sz w:val="22"/>
+          <w:szCs w:val="22"/>
+        </w:rPr>
+        <w:t>System Sequence Diagram of FEA-01: delete book</w:t>
+      </w:r>
+    </w:p>
+    <w:p>
+      <w:pPr>
+        <w:pStyle w:val="3"/>
+      </w:pPr>
+      <w:r>
+        <w:rPr>
           <w:rFonts w:hint="eastAsia"/>
         </w:rPr>
+        <w:lastRenderedPageBreak/>
+        <w:t>3.2.2 Operation Sequence Diagram</w:t>
+      </w:r>
+    </w:p>
+    <w:p>
+      <w:pPr>
+        <w:widowControl/>
+        <w:jc w:val="center"/>
+        <w:rPr>
+          <w:rFonts w:ascii="Times New Roman" w:eastAsia="標楷體" w:hAnsi="Times New Roman" w:cs="Times New Roman"/>
+        </w:rPr>
+      </w:pPr>
+      <w:r>
+        <w:rPr>
+          <w:noProof/>
+        </w:rPr>
+        <w:drawing>
+          <wp:inline distT="0" distB="0" distL="0" distR="0" wp14:anchorId="1AF2B5C2" wp14:editId="4BE7C7FC">
+            <wp:extent cx="5274310" cy="1555750"/>
+            <wp:effectExtent l="0" t="0" r="2540" b="6350"/>
+            <wp:docPr id="711182635" name="圖片 1"/>
+            <wp:cNvGraphicFramePr>
+              <a:graphicFrameLocks xmlns:a="http://schemas.openxmlformats.org/drawingml/2006/main" noChangeAspect="1"/>
+            </wp:cNvGraphicFramePr>
+            <a:graphic xmlns:a="http://schemas.openxmlformats.org/drawingml/2006/main">
+              <a:graphicData uri="http://schemas.openxmlformats.org/drawingml/2006/picture">
+                <pic:pic xmlns:pic="http://schemas.openxmlformats.org/drawingml/2006/picture">
+                  <pic:nvPicPr>
+                    <pic:cNvPr id="711182635" name=""/>
+                    <pic:cNvPicPr/>
+                  </pic:nvPicPr>
+                  <pic:blipFill>
+                    <a:blip r:embed="rId17"/>
+                    <a:stretch>
+                      <a:fillRect/>
+                    </a:stretch>
+                  </pic:blipFill>
+                  <pic:spPr>
+                    <a:xfrm>
+                      <a:off x="0" y="0"/>
+                      <a:ext cx="5274310" cy="1555750"/>
+                    </a:xfrm>
+                    <a:prstGeom prst="rect">
+                      <a:avLst/>
+                    </a:prstGeom>
+                  </pic:spPr>
+                </pic:pic>
+              </a:graphicData>
+            </a:graphic>
+          </wp:inline>
+        </w:drawing>
+      </w:r>
+    </w:p>
+    <w:p>
+      <w:pPr>
+        <w:jc w:val="center"/>
+      </w:pPr>
+      <w:r>
+        <w:rPr>
+          <w:rFonts w:ascii="Times New Roman" w:eastAsia="標楷體" w:hAnsi="Times New Roman" w:cs="Times New Roman" w:hint="eastAsia"/>
+          <w:b/>
+          <w:bCs/>
+          <w:i/>
+          <w:iCs/>
+          <w:sz w:val="22"/>
+          <w:szCs w:val="22"/>
+        </w:rPr>
+        <w:t xml:space="preserve">Figure </w:t>
+      </w:r>
+      <w:r>
+        <w:rPr>
+          <w:rFonts w:ascii="Times New Roman" w:eastAsia="標楷體" w:hAnsi="Times New Roman" w:cs="Times New Roman" w:hint="eastAsia"/>
+          <w:b/>
+          <w:bCs/>
+          <w:i/>
+          <w:iCs/>
+          <w:sz w:val="22"/>
+          <w:szCs w:val="22"/>
+        </w:rPr>
+        <w:t>3</w:t>
+      </w:r>
+      <w:r>
+        <w:rPr>
+          <w:rFonts w:ascii="Times New Roman" w:eastAsia="標楷體" w:hAnsi="Times New Roman" w:cs="Times New Roman" w:hint="eastAsia"/>
+          <w:b/>
+          <w:bCs/>
+          <w:i/>
+          <w:iCs/>
+          <w:sz w:val="22"/>
+          <w:szCs w:val="22"/>
+        </w:rPr>
+        <w:t>-</w:t>
+      </w:r>
+      <w:r>
+        <w:rPr>
+          <w:rFonts w:ascii="Times New Roman" w:eastAsia="標楷體" w:hAnsi="Times New Roman" w:cs="Times New Roman" w:hint="eastAsia"/>
+          <w:b/>
+          <w:bCs/>
+          <w:i/>
+          <w:iCs/>
+          <w:sz w:val="22"/>
+          <w:szCs w:val="22"/>
+        </w:rPr>
+        <w:t xml:space="preserve">7 Sequence </w:t>
+      </w:r>
+      <w:proofErr w:type="gramStart"/>
+      <w:r>
+        <w:rPr>
+          <w:rFonts w:ascii="Times New Roman" w:eastAsia="標楷體" w:hAnsi="Times New Roman" w:cs="Times New Roman" w:hint="eastAsia"/>
+          <w:b/>
+          <w:bCs/>
+          <w:i/>
+          <w:iCs/>
+          <w:sz w:val="22"/>
+          <w:szCs w:val="22"/>
+        </w:rPr>
+        <w:t>Diagram :</w:t>
+      </w:r>
+      <w:proofErr w:type="gramEnd"/>
+      <w:r>
+        <w:rPr>
+          <w:rFonts w:ascii="Times New Roman" w:eastAsia="標楷體" w:hAnsi="Times New Roman" w:cs="Times New Roman" w:hint="eastAsia"/>
+          <w:b/>
+          <w:bCs/>
+          <w:i/>
+          <w:iCs/>
+          <w:sz w:val="22"/>
+          <w:szCs w:val="22"/>
+        </w:rPr>
+        <w:t xml:space="preserve"> </w:t>
+      </w:r>
+      <w:proofErr w:type="spellStart"/>
+      <w:r>
+        <w:rPr>
+          <w:rFonts w:ascii="Times New Roman" w:eastAsia="標楷體" w:hAnsi="Times New Roman" w:cs="Times New Roman" w:hint="eastAsia"/>
+          <w:b/>
+          <w:bCs/>
+          <w:i/>
+          <w:iCs/>
+          <w:sz w:val="22"/>
+          <w:szCs w:val="22"/>
+        </w:rPr>
+        <w:t>checkOut</w:t>
+      </w:r>
+      <w:proofErr w:type="spellEnd"/>
+    </w:p>
+    <w:p>
+      <w:pPr>
+        <w:widowControl/>
+        <w:jc w:val="center"/>
+        <w:rPr>
+          <w:rFonts w:ascii="Times New Roman" w:eastAsia="標楷體" w:hAnsi="Times New Roman" w:cs="Times New Roman"/>
+        </w:rPr>
+      </w:pPr>
+      <w:r>
+        <w:rPr>
+          <w:noProof/>
+        </w:rPr>
+        <w:drawing>
+          <wp:inline distT="0" distB="0" distL="0" distR="0" wp14:anchorId="0537DF64" wp14:editId="20E923FB">
+            <wp:extent cx="5274310" cy="1488307"/>
+            <wp:effectExtent l="0" t="0" r="2540" b="0"/>
+            <wp:docPr id="308084301" name="圖片 1"/>
+            <wp:cNvGraphicFramePr>
+              <a:graphicFrameLocks xmlns:a="http://schemas.openxmlformats.org/drawingml/2006/main" noChangeAspect="1"/>
+            </wp:cNvGraphicFramePr>
+            <a:graphic xmlns:a="http://schemas.openxmlformats.org/drawingml/2006/main">
+              <a:graphicData uri="http://schemas.openxmlformats.org/drawingml/2006/picture">
+                <pic:pic xmlns:pic="http://schemas.openxmlformats.org/drawingml/2006/picture">
+                  <pic:nvPicPr>
+                    <pic:cNvPr id="308084301" name=""/>
+                    <pic:cNvPicPr/>
+                  </pic:nvPicPr>
+                  <pic:blipFill>
+                    <a:blip r:embed="rId18"/>
+                    <a:stretch>
+                      <a:fillRect/>
+                    </a:stretch>
+                  </pic:blipFill>
+                  <pic:spPr>
+                    <a:xfrm>
+                      <a:off x="0" y="0"/>
+                      <a:ext cx="5274310" cy="1488307"/>
+                    </a:xfrm>
+                    <a:prstGeom prst="rect">
+                      <a:avLst/>
+                    </a:prstGeom>
+                  </pic:spPr>
+                </pic:pic>
+              </a:graphicData>
+            </a:graphic>
+          </wp:inline>
+        </w:drawing>
+      </w:r>
+    </w:p>
+    <w:p>
+      <w:pPr>
+        <w:jc w:val="center"/>
+      </w:pPr>
+      <w:r>
+        <w:rPr>
+          <w:rFonts w:ascii="Times New Roman" w:eastAsia="標楷體" w:hAnsi="Times New Roman" w:cs="Times New Roman" w:hint="eastAsia"/>
+          <w:b/>
+          <w:bCs/>
+          <w:i/>
+          <w:iCs/>
+          <w:sz w:val="22"/>
+          <w:szCs w:val="22"/>
+        </w:rPr>
+        <w:t xml:space="preserve">Figure </w:t>
+      </w:r>
+      <w:r>
+        <w:rPr>
+          <w:rFonts w:ascii="Times New Roman" w:eastAsia="標楷體" w:hAnsi="Times New Roman" w:cs="Times New Roman" w:hint="eastAsia"/>
+          <w:b/>
+          <w:bCs/>
+          <w:i/>
+          <w:iCs/>
+          <w:sz w:val="22"/>
+          <w:szCs w:val="22"/>
+        </w:rPr>
+        <w:t>3</w:t>
+      </w:r>
+      <w:r>
+        <w:rPr>
+          <w:rFonts w:ascii="Times New Roman" w:eastAsia="標楷體" w:hAnsi="Times New Roman" w:cs="Times New Roman" w:hint="eastAsia"/>
+          <w:b/>
+          <w:bCs/>
+          <w:i/>
+          <w:iCs/>
+          <w:sz w:val="22"/>
+          <w:szCs w:val="22"/>
+        </w:rPr>
+        <w:t>-</w:t>
+      </w:r>
+      <w:r>
+        <w:rPr>
+          <w:rFonts w:ascii="Times New Roman" w:eastAsia="標楷體" w:hAnsi="Times New Roman" w:cs="Times New Roman" w:hint="eastAsia"/>
+          <w:b/>
+          <w:bCs/>
+          <w:i/>
+          <w:iCs/>
+          <w:sz w:val="22"/>
+          <w:szCs w:val="22"/>
+        </w:rPr>
+        <w:t xml:space="preserve">8 Sequence </w:t>
+      </w:r>
+      <w:proofErr w:type="gramStart"/>
+      <w:r>
+        <w:rPr>
+          <w:rFonts w:ascii="Times New Roman" w:eastAsia="標楷體" w:hAnsi="Times New Roman" w:cs="Times New Roman" w:hint="eastAsia"/>
+          <w:b/>
+          <w:bCs/>
+          <w:i/>
+          <w:iCs/>
+          <w:sz w:val="22"/>
+          <w:szCs w:val="22"/>
+        </w:rPr>
+        <w:t>Diagram :</w:t>
+      </w:r>
+      <w:proofErr w:type="gramEnd"/>
+      <w:r>
+        <w:rPr>
+          <w:rFonts w:ascii="Times New Roman" w:eastAsia="標楷體" w:hAnsi="Times New Roman" w:cs="Times New Roman" w:hint="eastAsia"/>
+          <w:b/>
+          <w:bCs/>
+          <w:i/>
+          <w:iCs/>
+          <w:sz w:val="22"/>
+          <w:szCs w:val="22"/>
+        </w:rPr>
+        <w:t xml:space="preserve"> </w:t>
+      </w:r>
+      <w:proofErr w:type="spellStart"/>
+      <w:r>
+        <w:rPr>
+          <w:rFonts w:ascii="Times New Roman" w:eastAsia="標楷體" w:hAnsi="Times New Roman" w:cs="Times New Roman" w:hint="eastAsia"/>
+          <w:b/>
+          <w:bCs/>
+          <w:i/>
+          <w:iCs/>
+          <w:sz w:val="22"/>
+          <w:szCs w:val="22"/>
+        </w:rPr>
+        <w:t>addBook</w:t>
+      </w:r>
+      <w:proofErr w:type="spellEnd"/>
+    </w:p>
+    <w:p>
+      <w:pPr>
+        <w:widowControl/>
+        <w:jc w:val="center"/>
+        <w:rPr>
+          <w:rFonts w:ascii="Times New Roman" w:eastAsia="標楷體" w:hAnsi="Times New Roman" w:cs="Times New Roman"/>
+        </w:rPr>
+      </w:pPr>
+      <w:r>
+        <w:rPr>
+          <w:noProof/>
+        </w:rPr>
+        <w:drawing>
+          <wp:inline distT="0" distB="0" distL="0" distR="0" wp14:anchorId="06801BCE" wp14:editId="7BB76235">
+            <wp:extent cx="4307906" cy="1952717"/>
+            <wp:effectExtent l="0" t="0" r="0" b="9525"/>
+            <wp:docPr id="1025247087" name="圖片 1"/>
+            <wp:cNvGraphicFramePr>
+              <a:graphicFrameLocks xmlns:a="http://schemas.openxmlformats.org/drawingml/2006/main" noChangeAspect="1"/>
+            </wp:cNvGraphicFramePr>
+            <a:graphic xmlns:a="http://schemas.openxmlformats.org/drawingml/2006/main">
+              <a:graphicData uri="http://schemas.openxmlformats.org/drawingml/2006/picture">
+                <pic:pic xmlns:pic="http://schemas.openxmlformats.org/drawingml/2006/picture">
+                  <pic:nvPicPr>
+                    <pic:cNvPr id="1025247087" name=""/>
+                    <pic:cNvPicPr/>
+                  </pic:nvPicPr>
+                  <pic:blipFill>
+                    <a:blip r:embed="rId19"/>
+                    <a:stretch>
+                      <a:fillRect/>
+                    </a:stretch>
+                  </pic:blipFill>
+                  <pic:spPr>
+                    <a:xfrm>
+                      <a:off x="0" y="0"/>
+                      <a:ext cx="4335309" cy="1965139"/>
+                    </a:xfrm>
+                    <a:prstGeom prst="rect">
+                      <a:avLst/>
+                    </a:prstGeom>
+                  </pic:spPr>
+                </pic:pic>
+              </a:graphicData>
+            </a:graphic>
+          </wp:inline>
+        </w:drawing>
+      </w:r>
+    </w:p>
+    <w:p>
+      <w:pPr>
+        <w:jc w:val="center"/>
+        <w:rPr>
+          <w:rFonts w:ascii="Times New Roman" w:eastAsia="標楷體" w:hAnsi="Times New Roman" w:cs="Times New Roman"/>
+          <w:b/>
+          <w:bCs/>
+          <w:i/>
+          <w:iCs/>
+          <w:sz w:val="22"/>
+          <w:szCs w:val="22"/>
+        </w:rPr>
+      </w:pPr>
+      <w:r>
+        <w:rPr>
+          <w:rFonts w:ascii="Times New Roman" w:eastAsia="標楷體" w:hAnsi="Times New Roman" w:cs="Times New Roman" w:hint="eastAsia"/>
+          <w:b/>
+          <w:bCs/>
+          <w:i/>
+          <w:iCs/>
+          <w:sz w:val="22"/>
+          <w:szCs w:val="22"/>
+        </w:rPr>
+        <w:t xml:space="preserve">Figure </w:t>
+      </w:r>
+      <w:r>
+        <w:rPr>
+          <w:rFonts w:ascii="Times New Roman" w:eastAsia="標楷體" w:hAnsi="Times New Roman" w:cs="Times New Roman" w:hint="eastAsia"/>
+          <w:b/>
+          <w:bCs/>
+          <w:i/>
+          <w:iCs/>
+          <w:sz w:val="22"/>
+          <w:szCs w:val="22"/>
+        </w:rPr>
+        <w:t>3</w:t>
+      </w:r>
+      <w:r>
+        <w:rPr>
+          <w:rFonts w:ascii="Times New Roman" w:eastAsia="標楷體" w:hAnsi="Times New Roman" w:cs="Times New Roman" w:hint="eastAsia"/>
+          <w:b/>
+          <w:bCs/>
+          <w:i/>
+          <w:iCs/>
+          <w:sz w:val="22"/>
+          <w:szCs w:val="22"/>
+        </w:rPr>
+        <w:t>-</w:t>
+      </w:r>
+      <w:r>
+        <w:rPr>
+          <w:rFonts w:ascii="Times New Roman" w:eastAsia="標楷體" w:hAnsi="Times New Roman" w:cs="Times New Roman" w:hint="eastAsia"/>
+          <w:b/>
+          <w:bCs/>
+          <w:i/>
+          <w:iCs/>
+          <w:sz w:val="22"/>
+          <w:szCs w:val="22"/>
+        </w:rPr>
+        <w:t xml:space="preserve">9 Sequence </w:t>
+      </w:r>
+      <w:proofErr w:type="gramStart"/>
+      <w:r>
+        <w:rPr>
+          <w:rFonts w:ascii="Times New Roman" w:eastAsia="標楷體" w:hAnsi="Times New Roman" w:cs="Times New Roman" w:hint="eastAsia"/>
+          <w:b/>
+          <w:bCs/>
+          <w:i/>
+          <w:iCs/>
+          <w:sz w:val="22"/>
+          <w:szCs w:val="22"/>
+        </w:rPr>
+        <w:t>Diagram :</w:t>
+      </w:r>
+      <w:proofErr w:type="gramEnd"/>
+      <w:r>
+        <w:rPr>
+          <w:rFonts w:ascii="Times New Roman" w:eastAsia="標楷體" w:hAnsi="Times New Roman" w:cs="Times New Roman" w:hint="eastAsia"/>
+          <w:b/>
+          <w:bCs/>
+          <w:i/>
+          <w:iCs/>
+          <w:sz w:val="22"/>
+          <w:szCs w:val="22"/>
+        </w:rPr>
+        <w:t xml:space="preserve"> </w:t>
+      </w:r>
+      <w:proofErr w:type="spellStart"/>
+      <w:r>
+        <w:rPr>
+          <w:rFonts w:ascii="Times New Roman" w:eastAsia="標楷體" w:hAnsi="Times New Roman" w:cs="Times New Roman" w:hint="eastAsia"/>
+          <w:b/>
+          <w:bCs/>
+          <w:i/>
+          <w:iCs/>
+          <w:sz w:val="22"/>
+          <w:szCs w:val="22"/>
+        </w:rPr>
+        <w:t>viewBookList</w:t>
+      </w:r>
+      <w:proofErr w:type="spellEnd"/>
+    </w:p>
+    <w:p>
+      <w:pPr>
+        <w:jc w:val="center"/>
+      </w:pPr>
+    </w:p>
+    <w:p>
+      <w:pPr>
+        <w:widowControl/>
+        <w:jc w:val="center"/>
+        <w:rPr>
+          <w:rFonts w:ascii="Times New Roman" w:eastAsia="標楷體" w:hAnsi="Times New Roman" w:cs="Times New Roman"/>
+        </w:rPr>
+      </w:pPr>
+      <w:r>
+        <w:rPr>
+          <w:noProof/>
+        </w:rPr>
+        <w:lastRenderedPageBreak/>
+        <w:drawing>
+          <wp:inline distT="0" distB="0" distL="0" distR="0" wp14:anchorId="4FB9F166" wp14:editId="65F69FB0">
+            <wp:extent cx="5274310" cy="1675130"/>
+            <wp:effectExtent l="0" t="0" r="2540" b="1270"/>
+            <wp:docPr id="871329710" name="圖片 1"/>
+            <wp:cNvGraphicFramePr>
+              <a:graphicFrameLocks xmlns:a="http://schemas.openxmlformats.org/drawingml/2006/main" noChangeAspect="1"/>
+            </wp:cNvGraphicFramePr>
+            <a:graphic xmlns:a="http://schemas.openxmlformats.org/drawingml/2006/main">
+              <a:graphicData uri="http://schemas.openxmlformats.org/drawingml/2006/picture">
+                <pic:pic xmlns:pic="http://schemas.openxmlformats.org/drawingml/2006/picture">
+                  <pic:nvPicPr>
+                    <pic:cNvPr id="871329710" name=""/>
+                    <pic:cNvPicPr/>
+                  </pic:nvPicPr>
+                  <pic:blipFill>
+                    <a:blip r:embed="rId20"/>
+                    <a:stretch>
+                      <a:fillRect/>
+                    </a:stretch>
+                  </pic:blipFill>
+                  <pic:spPr>
+                    <a:xfrm>
+                      <a:off x="0" y="0"/>
+                      <a:ext cx="5274310" cy="1675130"/>
+                    </a:xfrm>
+                    <a:prstGeom prst="rect">
+                      <a:avLst/>
+                    </a:prstGeom>
+                  </pic:spPr>
+                </pic:pic>
+              </a:graphicData>
+            </a:graphic>
+          </wp:inline>
+        </w:drawing>
+      </w:r>
+    </w:p>
+    <w:p>
+      <w:pPr>
+        <w:jc w:val="center"/>
+      </w:pPr>
+      <w:r>
+        <w:rPr>
+          <w:rFonts w:ascii="Times New Roman" w:eastAsia="標楷體" w:hAnsi="Times New Roman" w:cs="Times New Roman" w:hint="eastAsia"/>
+          <w:b/>
+          <w:bCs/>
+          <w:i/>
+          <w:iCs/>
+          <w:sz w:val="22"/>
+          <w:szCs w:val="22"/>
+        </w:rPr>
+        <w:t xml:space="preserve">Figure </w:t>
+      </w:r>
+      <w:r>
+        <w:rPr>
+          <w:rFonts w:ascii="Times New Roman" w:eastAsia="標楷體" w:hAnsi="Times New Roman" w:cs="Times New Roman" w:hint="eastAsia"/>
+          <w:b/>
+          <w:bCs/>
+          <w:i/>
+          <w:iCs/>
+          <w:sz w:val="22"/>
+          <w:szCs w:val="22"/>
+        </w:rPr>
+        <w:t>3</w:t>
+      </w:r>
+      <w:r>
+        <w:rPr>
+          <w:rFonts w:ascii="Times New Roman" w:eastAsia="標楷體" w:hAnsi="Times New Roman" w:cs="Times New Roman" w:hint="eastAsia"/>
+          <w:b/>
+          <w:bCs/>
+          <w:i/>
+          <w:iCs/>
+          <w:sz w:val="22"/>
+          <w:szCs w:val="22"/>
+        </w:rPr>
+        <w:t>-</w:t>
+      </w:r>
+      <w:r>
+        <w:rPr>
+          <w:rFonts w:ascii="Times New Roman" w:eastAsia="標楷體" w:hAnsi="Times New Roman" w:cs="Times New Roman" w:hint="eastAsia"/>
+          <w:b/>
+          <w:bCs/>
+          <w:i/>
+          <w:iCs/>
+          <w:sz w:val="22"/>
+          <w:szCs w:val="22"/>
+        </w:rPr>
+        <w:t xml:space="preserve">10 Sequence </w:t>
+      </w:r>
+      <w:proofErr w:type="gramStart"/>
+      <w:r>
+        <w:rPr>
+          <w:rFonts w:ascii="Times New Roman" w:eastAsia="標楷體" w:hAnsi="Times New Roman" w:cs="Times New Roman" w:hint="eastAsia"/>
+          <w:b/>
+          <w:bCs/>
+          <w:i/>
+          <w:iCs/>
+          <w:sz w:val="22"/>
+          <w:szCs w:val="22"/>
+        </w:rPr>
+        <w:t>Diagram :</w:t>
+      </w:r>
+      <w:proofErr w:type="gramEnd"/>
+      <w:r>
+        <w:rPr>
+          <w:rFonts w:ascii="Times New Roman" w:eastAsia="標楷體" w:hAnsi="Times New Roman" w:cs="Times New Roman" w:hint="eastAsia"/>
+          <w:b/>
+          <w:bCs/>
+          <w:i/>
+          <w:iCs/>
+          <w:sz w:val="22"/>
+          <w:szCs w:val="22"/>
+        </w:rPr>
+        <w:t xml:space="preserve"> </w:t>
+      </w:r>
+      <w:proofErr w:type="spellStart"/>
+      <w:r>
+        <w:rPr>
+          <w:rFonts w:ascii="Times New Roman" w:eastAsia="標楷體" w:hAnsi="Times New Roman" w:cs="Times New Roman" w:hint="eastAsia"/>
+          <w:b/>
+          <w:bCs/>
+          <w:i/>
+          <w:iCs/>
+          <w:sz w:val="22"/>
+          <w:szCs w:val="22"/>
+        </w:rPr>
+        <w:t>updateBook</w:t>
+      </w:r>
+      <w:proofErr w:type="spellEnd"/>
+    </w:p>
+    <w:p>
+      <w:pPr>
+        <w:widowControl/>
+        <w:jc w:val="center"/>
+        <w:rPr>
+          <w:rFonts w:ascii="Times New Roman" w:eastAsia="標楷體" w:hAnsi="Times New Roman" w:cs="Times New Roman"/>
+        </w:rPr>
+      </w:pPr>
+      <w:r>
+        <w:rPr>
+          <w:noProof/>
+        </w:rPr>
+        <w:drawing>
+          <wp:inline distT="0" distB="0" distL="0" distR="0" wp14:anchorId="225BF26B" wp14:editId="2E0D8947">
+            <wp:extent cx="5274310" cy="1831975"/>
+            <wp:effectExtent l="0" t="0" r="2540" b="0"/>
+            <wp:docPr id="119063444" name="圖片 1"/>
+            <wp:cNvGraphicFramePr>
+              <a:graphicFrameLocks xmlns:a="http://schemas.openxmlformats.org/drawingml/2006/main" noChangeAspect="1"/>
+            </wp:cNvGraphicFramePr>
+            <a:graphic xmlns:a="http://schemas.openxmlformats.org/drawingml/2006/main">
+              <a:graphicData uri="http://schemas.openxmlformats.org/drawingml/2006/picture">
+                <pic:pic xmlns:pic="http://schemas.openxmlformats.org/drawingml/2006/picture">
+                  <pic:nvPicPr>
+                    <pic:cNvPr id="119063444" name=""/>
+                    <pic:cNvPicPr/>
+                  </pic:nvPicPr>
+                  <pic:blipFill>
+                    <a:blip r:embed="rId21"/>
+                    <a:stretch>
+                      <a:fillRect/>
+                    </a:stretch>
+                  </pic:blipFill>
+                  <pic:spPr>
+                    <a:xfrm>
+                      <a:off x="0" y="0"/>
+                      <a:ext cx="5274310" cy="1831975"/>
+                    </a:xfrm>
+                    <a:prstGeom prst="rect">
+                      <a:avLst/>
+                    </a:prstGeom>
+                  </pic:spPr>
+                </pic:pic>
+              </a:graphicData>
+            </a:graphic>
+          </wp:inline>
+        </w:drawing>
+      </w:r>
+    </w:p>
+    <w:p>
+      <w:pPr>
+        <w:jc w:val="center"/>
+      </w:pPr>
+      <w:r>
+        <w:rPr>
+          <w:rFonts w:ascii="Times New Roman" w:eastAsia="標楷體" w:hAnsi="Times New Roman" w:cs="Times New Roman" w:hint="eastAsia"/>
+          <w:b/>
+          <w:bCs/>
+          <w:i/>
+          <w:iCs/>
+          <w:sz w:val="22"/>
+          <w:szCs w:val="22"/>
+        </w:rPr>
+        <w:t xml:space="preserve">Figure </w:t>
+      </w:r>
+      <w:r>
+        <w:rPr>
+          <w:rFonts w:ascii="Times New Roman" w:eastAsia="標楷體" w:hAnsi="Times New Roman" w:cs="Times New Roman" w:hint="eastAsia"/>
+          <w:b/>
+          <w:bCs/>
+          <w:i/>
+          <w:iCs/>
+          <w:sz w:val="22"/>
+          <w:szCs w:val="22"/>
+        </w:rPr>
+        <w:t>3</w:t>
+      </w:r>
+      <w:r>
+        <w:rPr>
+          <w:rFonts w:ascii="Times New Roman" w:eastAsia="標楷體" w:hAnsi="Times New Roman" w:cs="Times New Roman" w:hint="eastAsia"/>
+          <w:b/>
+          <w:bCs/>
+          <w:i/>
+          <w:iCs/>
+          <w:sz w:val="22"/>
+          <w:szCs w:val="22"/>
+        </w:rPr>
+        <w:t>-</w:t>
+      </w:r>
+      <w:r>
+        <w:rPr>
+          <w:rFonts w:ascii="Times New Roman" w:eastAsia="標楷體" w:hAnsi="Times New Roman" w:cs="Times New Roman" w:hint="eastAsia"/>
+          <w:b/>
+          <w:bCs/>
+          <w:i/>
+          <w:iCs/>
+          <w:sz w:val="22"/>
+          <w:szCs w:val="22"/>
+        </w:rPr>
+        <w:t xml:space="preserve">11 Sequence </w:t>
+      </w:r>
+      <w:proofErr w:type="gramStart"/>
+      <w:r>
+        <w:rPr>
+          <w:rFonts w:ascii="Times New Roman" w:eastAsia="標楷體" w:hAnsi="Times New Roman" w:cs="Times New Roman" w:hint="eastAsia"/>
+          <w:b/>
+          <w:bCs/>
+          <w:i/>
+          <w:iCs/>
+          <w:sz w:val="22"/>
+          <w:szCs w:val="22"/>
+        </w:rPr>
+        <w:t>Diagram :</w:t>
+      </w:r>
+      <w:proofErr w:type="gramEnd"/>
+      <w:r>
+        <w:rPr>
+          <w:rFonts w:ascii="Times New Roman" w:eastAsia="標楷體" w:hAnsi="Times New Roman" w:cs="Times New Roman" w:hint="eastAsia"/>
+          <w:b/>
+          <w:bCs/>
+          <w:i/>
+          <w:iCs/>
+          <w:sz w:val="22"/>
+          <w:szCs w:val="22"/>
+        </w:rPr>
+        <w:t xml:space="preserve"> </w:t>
+      </w:r>
+      <w:proofErr w:type="spellStart"/>
+      <w:r>
+        <w:rPr>
+          <w:rFonts w:ascii="Times New Roman" w:eastAsia="標楷體" w:hAnsi="Times New Roman" w:cs="Times New Roman" w:hint="eastAsia"/>
+          <w:b/>
+          <w:bCs/>
+          <w:i/>
+          <w:iCs/>
+          <w:sz w:val="22"/>
+          <w:szCs w:val="22"/>
+        </w:rPr>
+        <w:t>deleteBook</w:t>
+      </w:r>
+      <w:proofErr w:type="spellEnd"/>
+    </w:p>
+    <w:p>
+      <w:pPr>
+        <w:pStyle w:val="2"/>
+      </w:pPr>
+      <w:r>
+        <w:rPr>
+          <w:rFonts w:hint="eastAsia"/>
+        </w:rPr>
+        <w:t>3.3 Design Class Diagram</w:t>
+      </w:r>
+    </w:p>
+    <w:p>
+      <w:pPr>
+        <w:jc w:val="center"/>
+      </w:pPr>
+      <w:r>
+        <w:rPr>
+          <w:noProof/>
+        </w:rPr>
+        <w:drawing>
+          <wp:inline distT="0" distB="0" distL="0" distR="0" wp14:anchorId="2ABB25DB" wp14:editId="520609FD">
+            <wp:extent cx="5274310" cy="1979930"/>
+            <wp:effectExtent l="0" t="0" r="2540" b="1270"/>
+            <wp:docPr id="2" name="圖片 2"/>
+            <wp:cNvGraphicFramePr>
+              <a:graphicFrameLocks xmlns:a="http://schemas.openxmlformats.org/drawingml/2006/main" noChangeAspect="1"/>
+            </wp:cNvGraphicFramePr>
+            <a:graphic xmlns:a="http://schemas.openxmlformats.org/drawingml/2006/main">
+              <a:graphicData uri="http://schemas.openxmlformats.org/drawingml/2006/picture">
+                <pic:pic xmlns:pic="http://schemas.openxmlformats.org/drawingml/2006/picture">
+                  <pic:nvPicPr>
+                    <pic:cNvPr id="0" name="Picture 1"/>
+                    <pic:cNvPicPr>
+                      <a:picLocks noChangeAspect="1" noChangeArrowheads="1"/>
+                    </pic:cNvPicPr>
+                  </pic:nvPicPr>
+                  <pic:blipFill>
+                    <a:blip r:embed="rId22">
+                      <a:extLst>
+                        <a:ext uri="{28A0092B-C50C-407E-A947-70E740481C1C}">
+                          <a14:useLocalDpi xmlns:a14="http://schemas.microsoft.com/office/drawing/2010/main" val="0"/>
+                        </a:ext>
+                      </a:extLst>
+                    </a:blip>
+                    <a:srcRect/>
+                    <a:stretch>
+                      <a:fillRect/>
+                    </a:stretch>
+                  </pic:blipFill>
+                  <pic:spPr bwMode="auto">
+                    <a:xfrm>
+                      <a:off x="0" y="0"/>
+                      <a:ext cx="5274310" cy="1979930"/>
+                    </a:xfrm>
+                    <a:prstGeom prst="rect">
+                      <a:avLst/>
+                    </a:prstGeom>
+                    <a:noFill/>
+                    <a:ln>
+                      <a:noFill/>
+                    </a:ln>
+                  </pic:spPr>
+                </pic:pic>
+              </a:graphicData>
+            </a:graphic>
+          </wp:inline>
+        </w:drawing>
+      </w:r>
+    </w:p>
+    <w:p>
+      <w:pPr>
+        <w:jc w:val="center"/>
+        <w:rPr>
+          <w:rFonts w:ascii="Times New Roman" w:eastAsia="標楷體" w:hAnsi="Times New Roman" w:cs="Times New Roman"/>
+          <w:b/>
+          <w:bCs/>
+          <w:i/>
+          <w:iCs/>
+          <w:sz w:val="22"/>
+          <w:szCs w:val="22"/>
+        </w:rPr>
+      </w:pPr>
+      <w:r>
+        <w:rPr>
+          <w:rFonts w:ascii="Times New Roman" w:eastAsia="標楷體" w:hAnsi="Times New Roman" w:cs="Times New Roman" w:hint="eastAsia"/>
+          <w:b/>
+          <w:bCs/>
+          <w:i/>
+          <w:iCs/>
+          <w:sz w:val="22"/>
+          <w:szCs w:val="22"/>
+        </w:rPr>
+        <w:t xml:space="preserve">Figure </w:t>
+      </w:r>
+      <w:r>
+        <w:rPr>
+          <w:rFonts w:ascii="Times New Roman" w:eastAsia="標楷體" w:hAnsi="Times New Roman" w:cs="Times New Roman" w:hint="eastAsia"/>
+          <w:b/>
+          <w:bCs/>
+          <w:i/>
+          <w:iCs/>
+          <w:sz w:val="22"/>
+          <w:szCs w:val="22"/>
+        </w:rPr>
+        <w:t>3</w:t>
+      </w:r>
+      <w:r>
+        <w:rPr>
+          <w:rFonts w:ascii="Times New Roman" w:eastAsia="標楷體" w:hAnsi="Times New Roman" w:cs="Times New Roman" w:hint="eastAsia"/>
+          <w:b/>
+          <w:bCs/>
+          <w:i/>
+          <w:iCs/>
+          <w:sz w:val="22"/>
+          <w:szCs w:val="22"/>
+        </w:rPr>
+        <w:t>-</w:t>
+      </w:r>
+      <w:r>
+        <w:rPr>
+          <w:rFonts w:ascii="Times New Roman" w:eastAsia="標楷體" w:hAnsi="Times New Roman" w:cs="Times New Roman" w:hint="eastAsia"/>
+          <w:b/>
+          <w:bCs/>
+          <w:i/>
+          <w:iCs/>
+          <w:sz w:val="22"/>
+          <w:szCs w:val="22"/>
+        </w:rPr>
+        <w:t>12 Design Class Model</w:t>
+      </w:r>
+    </w:p>
+    <w:p>
+      <w:pPr>
+        <w:jc w:val="center"/>
       </w:pPr>
     </w:p>
     <w:p>

</xml_diff>